<commit_message>
Resolve Venture direction, institution name, Amarath title, Serenquill accession
Co-Authored-By: Claude Sonnet 5.5 <noreply@anthropic.com>
Claude-Session: https://claude.ai/code/session_01JpcpLvtS7aJ4eQsGwHD4Tg
</commit_message>
<xml_diff>
--- a/docx/Carya_Imparatorluk.docx
+++ b/docx/Carya_Imparatorluk.docx
@@ -2723,7 +2723,7 @@
         <w:rPr>
           <w:rFonts w:ascii="Georgia" w:hAnsi="Georgia" w:cs="Georgia" w:eastAsia="Georgia"/>
         </w:rPr>
-        <w:t>Şehir fethedildikten sonra buraya yerleştirilen Mac Alisterlar, Serenquill hanesinden sonra şehirdeki en nüfuzlu aile konumuna yükselmiştir. Öyle ki imparatorlukla en fazla akrabalık bağı bulunan soylar arasında ilk sırada anılırlar. Serenquill’de ticaretin büyük kısmını onlar üstlenir; özellikle mürekkep ticaretinde yüksek paya sahiptirler. Şehirdeki diğer ailelerin aksine bağlılıkları önce imparatora, sonra Serenquill’e olduğundan bu tutumları nedeniyle her zaman sevilmezler.</w:t>
+        <w:t>Şehir teslim olduktan sonra buraya yerleştirilen Mac Alisterlar, Serenquill hanesinden sonra şehirdeki en nüfuzlu aile konumuna yükselmiştir. Öyle ki imparatorlukla en fazla akrabalık bağı bulunan soylar arasında ilk sırada anılırlar. Serenquill’de ticaretin büyük kısmını onlar üstlenir; özellikle mürekkep ticaretinde yüksek paya sahiptirler. Şehirdeki diğer ailelerin aksine bağlılıkları önce imparatora, sonra Serenquill’e olduğundan bu tutumları nedeniyle her zaman sevilmezler.</w:t>
       </w:r>
     </w:p>
     <w:p>
@@ -3797,7 +3797,7 @@
         <w:rPr>
           <w:rFonts w:ascii="Georgia" w:hAnsi="Georgia" w:cs="Georgia" w:eastAsia="Georgia"/>
         </w:rPr>
-        <w:t>Çok eski çağlarda Aux'taki dini baskılardan ve uyumsuzluklardan kaçarak İmparatorluğa sığınan bu aile, ilk birkaç yüzyıl boyunca farklı kültürleri ve inançları nedeniyle hep dışlanmış ve sorgulanmıştır. Ancak zamanla hayatta kalma güdüsüyle radikal bir dönüşüm geçirmiş, İmparatorluk Kilisesi'ni herkesten çok benimsemiş ve bu yeni inançta sergiledikleri yobazlıkla ün salmışlardır. Günümüzde şehirdeki diğer aileler tarafından sinsi ve fazlasıyla tehlikeli bulunurlar; ancak İmparatorluk, La Seraphine hanesini bilerek orada tutar. Çünkü güç kazanmak için rakiplerinin en ufak dini ya da yasal hatasını kollayan bu aile, Arcan's Gate’in başına buyruk büyücülerini dizginleyen mükemmel bir güvenlik sübabıdır.</w:t>
+        <w:t>Çok eski çağlarda Aux'taki dini baskılardan ve uyumsuzluklardan kaçarak İmparatorluğa sığınan bu aile, ilk birkaç yüzyıl boyunca farklı kültürleri ve inançları nedeniyle hep dışlanmış ve sorgulanmıştır. Ancak zamanla hayatta kalma güdüsüyle radikal bir dönüşüm geçirmiş, Yeryüzü Tapınağı'nı herkesten çok benimsemiş ve bu yeni inançta sergiledikleri yobazlıkla ün salmışlardır. Günümüzde şehirdeki diğer aileler tarafından sinsi ve fazlasıyla tehlikeli bulunurlar; ancak İmparatorluk, La Seraphine hanesini bilerek orada tutar. Çünkü güç kazanmak için rakiplerinin en ufak dini ya da yasal hatasını kollayan bu aile, Arcan's Gate’in başına buyruk büyücülerini dizginleyen mükemmel bir güvenlik sübabıdır.</w:t>
       </w:r>
     </w:p>
     <w:p>
@@ -4038,7 +4038,7 @@
         <w:rPr>
           <w:rFonts w:ascii="Georgia" w:hAnsi="Georgia" w:cs="Georgia" w:eastAsia="Georgia"/>
         </w:rPr>
-        <w:t>Daha önce Aquamere şehrinin kozmopolit yapısında tecrübe kazanmış olan Slezk ailesi, o çok kültürlü deneyimi alıp Greenhall’un bürokratik ve dini işlerini yönetmesi için buraya gönderilmiştir. Dışarıdan bakıldığında barışçıl ve hoşgörülü bir bürokrat hanesi gibi görünürler; ancak bu yumuşak yüzeyin altında katı bir misyonerlik zihniyeti yatar. Onların nihai amacı, bölgedeki yeşilderili halkları birer araç olarak kullanmak ve onları kendi köklü inançları olan "Gorg ve Morg"dan kopararak İmparatorluğun resmî dini olan "Amarath"a geçirmektir. Slezklere göre bir yeşilderilinin ruhu ancak İmparatorluğun dinine biat ettiğinde kurtulabilir; bu yüzden hoşgörüleri aslında bir asimilasyon silahıdır.</w:t>
+        <w:t>Daha önce Aquamere şehrinin kozmopolit yapısında tecrübe kazanmış olan Slezk ailesi, o çok kültürlü deneyimi alıp Greenhall’un bürokratik ve dini işlerini yönetmesi için buraya gönderilmiştir. Dışarıdan bakıldığında barışçıl ve hoşgörülü bir bürokrat hanesi gibi görünürler; ancak bu yumuşak yüzeyin altında katı bir misyonerlik zihniyeti yatar. Onların nihai amacı, bölgedeki yeşilderili halkları birer araç olarak kullanmak ve onları kendi köklü inançları olan "Gork ve Morg"dan kopararak İmparatorluğun resmî inancı olan Yeryüzü İnancı’na geçirmektir. Slezklere göre bir yeşilderilinin ruhu ancak İmparatorluğun dinine biat ettiğinde kurtulabilir; bu yüzden hoşgörüleri aslında bir asimilasyon silahıdır.</w:t>
       </w:r>
     </w:p>
     <w:sectPr>

</xml_diff>

<commit_message>
Resolve founding order, Blackship/Blackfish, Archantus/Koran, Inquisition
Co-Authored-By: Claude Sonnet 5.5 <noreply@anthropic.com>
Claude-Session: https://claude.ai/code/session_01JpcpLvtS7aJ4eQsGwHD4Tg
</commit_message>
<xml_diff>
--- a/docx/Carya_Imparatorluk.docx
+++ b/docx/Carya_Imparatorluk.docx
@@ -525,7 +525,7 @@
         <w:rPr>
           <w:rFonts w:ascii="Georgia" w:hAnsi="Georgia" w:cs="Georgia" w:eastAsia="Georgia"/>
         </w:rPr>
-        <w:t>Arcan’s Gate’in kökeni, Yükseliş’ten önceki dönemlere uzanır. Şehrin temeli, Koran adlı bir büyücünün inşa ettirdiği kule etrafında atılmıştır. Zamanla bu yapı, bir eğitim ve araştırma merkezine dönüşmüş ve çevresinde büyü temelli bir yerleşim gelişmiştir.</w:t>
+        <w:t>Arcan’s Gate’in kökeni, Yükseliş’ten önceki dönemlere uzanır. Şehrin temeli, Koran adlı bir büyücünün inşa ettirdiği kule etrafında atılmıştır. Koran güçlü bir büyücüydü ama soylu değildi; krallıkta yükselmiş ve Arcan hanesinden biriyle evlenmiş, kan bağı olmasa da bu hanenin bir parçası sayılmıştır. Boş bir arazide kurduğu büyücü kulesi, o ilerleyen yıllarda tanrılar arasındaki bir olayda yükselip tanrı katına çıkana kadar da büyümeye devam etmiştir. Kule zamanla bir eğitim ve araştırma merkezine, sonunda diyarın en büyük büyücü akademisine dönüşmüştür (elfler kendi büyücü okullarının hâlâ daha büyük olduğunu söyler). Kule doğal bir cazibe merkezi olduğundan çevresinde büyü temelli bir yerleşim gelişmiş ve bu yerleşim zamanla şehre dönüşmüştür.</w:t>
       </w:r>
     </w:p>
     <w:p>
@@ -860,7 +860,7 @@
         <w:rPr>
           <w:rFonts w:ascii="Georgia" w:hAnsi="Georgia" w:cs="Georgia" w:eastAsia="Georgia"/>
         </w:rPr>
-        <w:t>Karnabahar Kasabası, Florentina İmparatorluğu’nun en önemli tarım merkezlerinden biri olarak geniş ve verimli arazilere yayılmış planlı bir yerleşimdir. Kasaba, yaşamdan çok üretime odaklıdır; nüfus azdır ve halkın büyük kısmı tarım işçileri ile denetleyicilerden oluşur. Dayanıklı sebzeler ve tahıllar burada yoğun şekilde üretilir ve imparatorluğun gıda ihtiyacının büyük bölümü buradan karşılanır. Stratejik önemi nedeniyle güvenlik üst düzeydedir; çevresi devriyeler ve küçük garnizonlarla korunur. Ancak tek geçim kaynağının tarım olması, kasabayı kuraklık ya da hastalıklara karşı kırılgan hale getirir.</w:t>
+        <w:t>Karnabahar Kasabası, İmparatorluğun en önemli tarım merkezlerinden biri olarak geniş ve verimli arazilere yayılmış planlı bir yerleşimdir. Kasaba, yaşamdan çok üretime odaklıdır; nüfus azdır ve halkın büyük kısmı tarım işçileri ile denetleyicilerden oluşur. Dayanıklı sebzeler ve tahıllar burada yoğun şekilde üretilir ve imparatorluğun gıda ihtiyacının büyük bölümü buradan karşılanır. Stratejik önemi nedeniyle güvenlik üst düzeydedir; çevresi devriyeler ve küçük garnizonlarla korunur. Ancak tek geçim kaynağının tarım olması, kasabayı kuraklık ya da hastalıklara karşı kırılgan hale getirir.</w:t>
       </w:r>
     </w:p>
     <w:p>
@@ -1489,7 +1489,7 @@
         <w:rPr>
           <w:rFonts w:ascii="Georgia" w:hAnsi="Georgia" w:cs="Georgia" w:eastAsia="Georgia"/>
         </w:rPr>
-        <w:t>Yeryüzü Tapınağı ile olan bağ ise saf bir kutsallıktan ziyade karşılıklı çıkar ortaklığına dayanır. Tapınak hanedana ilahi meşruiyet kazandırır; hanedan da tapınağı imparatorluk düzeninin merkezine yerleştirerek gücünü pekiştirir. Ancak bu bağlılık mutlak bir inançtan çok dengeli bir ittifaktır; farklı bir kral tapınağa bu ölçüde yaslanmayabilir, farklı bir dini yapı da krala bu kadar güçlü bir itaat öğretisi üretmeyebilir. İmparatorun gücü yalnızca tapınaktan gelmez; Archantus Büyücü Okulu, dini bir sadakatten ziyade Archantus’un mirası üzerinden imparatorluğa bağlıdır ve bu da hanedanın entelektüel ve büyüsel dayanaklarından biridir. Diğer lordlar ise kimi zaman çıkarları, kimi zaman korkuları nedeniyle merkeze bağlı kalır; böylece Florentina’da düzen, inanç, büyü ve siyasal hesap arasında kurulmuş hassas ama sağlam bir dengeyle ayakta durur.</w:t>
+        <w:t>Yeryüzü Tapınağı ile olan bağ ise saf bir kutsallıktan ziyade karşılıklı çıkar ortaklığına dayanır. Tapınak hanedana ilahi meşruiyet kazandırır; hanedan da tapınağı imparatorluk düzeninin merkezine yerleştirerek gücünü pekiştirir. Ancak bu bağlılık mutlak bir inançtan çok dengeli bir ittifaktır; farklı bir kral tapınağa bu ölçüde yaslanmayabilir, farklı bir dini yapı da krala bu kadar güçlü bir itaat öğretisi üretmeyebilir. İmparatorun gücü yalnızca tapınaktan gelmez; Arcan’s Gate’teki Archantus Büyücü Okulu, dini bir sadakatten ziyade Archantus’un mirası üzerinden imparatorluğa bağlıdır ve bu da hanedanın entelektüel ve büyüsel dayanaklarından biridir. Diğer lordlar ise kimi zaman çıkarları, kimi zaman korkuları nedeniyle merkeze bağlı kalır; böylece Florentina’da düzen, inanç, büyü ve siyasal hesap arasında kurulmuş hassas ama sağlam bir dengeyle ayakta durur.</w:t>
       </w:r>
     </w:p>
     <w:p>
@@ -1797,7 +1797,7 @@
         <w:rPr>
           <w:rFonts w:ascii="Georgia" w:hAnsi="Georgia" w:cs="Georgia" w:eastAsia="Georgia"/>
         </w:rPr>
-        <w:t>Strazni ailesi, imparatorluk düzeninin en sert ve en tavizsiz yüzünü temsil eder. Katı kuralcılıklarıyla bilinirler; küçük bir heretiklik kırıntısını ortadan kaldırmak için bütün bir ormanı yakmaktan çekinmezler. Engizisyonun temellerini atan hanedan olarak, düzeni koruma görevini inançtan çok disiplin ve korku üzerinden tanımlarlar. Onlar için sapma, büyümeden bastırılması gereken bir hastalıktır. Bu nedenle yasama, yürütme, yargı ve ordu kademelerinde yoğun şekilde yer alır; kanunları yazar, uygular ve gerektiğinde bizzat infaz ederler. Diğer soylu aileler tarafından sertlikleri ve hoşgörüsüzlükleri nedeniyle sevilmezler; ancak imparatorluk, özellikle kriz zamanlarında, Strazni gibi bir güce ihtiyaç duyar. Florentina Hanedanı’na üst derecede bağlıdırlar ve bu bağlılık neredeyse mutlak sadakat seviyesindedir. Onlardan daha bağlı oldukları tek yapı Yeryüzü Tapınağı’dır; fakat bu bağlılık dahi saf bir iman değil, düzenin kutsallığına duyulan inançtan doğar. Hatta bazı noktalarda tapınağın kendisinden bile daha katı olabilirler. Strazni’nin yobazlığı dinden çok düzenin korunmasına dayanır; onlar için merhamet bir lüks, istikrar ise vazgeçilmez bir zorunluluktur.</w:t>
+        <w:t>Strazni ailesi, imparatorluk düzeninin en sert ve en tavizsiz yüzünü temsil eder. Katı kuralcılıklarıyla bilinirler; küçük bir heretiklik kırıntısını ortadan kaldırmak için bütün bir ormanı yakmaktan çekinmezler. Engizisyonun temellerini atan hanedan olarak (Engizisyon, imparatora doğrudan bağlı güvenlik ve yargı gücüdür ve başında Strazni vardır; Alimler yasayı koyar, Engizisyon ise diyarda yasayı uygular ve infaz eder), düzeni koruma görevini inançtan çok disiplin ve korku üzerinden tanımlarlar. Onlar için sapma, büyümeden bastırılması gereken bir hastalıktır. Bu nedenle yasama, yürütme, yargı ve ordu kademelerinde yoğun şekilde yer alır; kanunları yazar, uygular ve gerektiğinde bizzat infaz ederler. Diğer soylu aileler tarafından sertlikleri ve hoşgörüsüzlükleri nedeniyle sevilmezler; ancak imparatorluk, özellikle kriz zamanlarında, Strazni gibi bir güce ihtiyaç duyar. Florentina Hanedanı’na üst derecede bağlıdırlar ve bu bağlılık neredeyse mutlak sadakat seviyesindedir. Onlardan daha bağlı oldukları tek yapı Yeryüzü Tapınağı’dır; fakat bu bağlılık dahi saf bir iman değil, düzenin kutsallığına duyulan inançtan doğar. Hatta bazı noktalarda tapınağın kendisinden bile daha katı olabilirler. Strazni’nin yobazlığı dinden çok düzenin korunmasına dayanır; onlar için merhamet bir lüks, istikrar ise vazgeçilmez bir zorunluluktur.</w:t>
       </w:r>
     </w:p>
     <w:p>
@@ -2482,7 +2482,7 @@
         <w:rPr>
           <w:rFonts w:ascii="Georgia" w:hAnsi="Georgia" w:cs="Georgia" w:eastAsia="Georgia"/>
         </w:rPr>
-        <w:t>Blackship ailesi köken olarak eski korsanlara dayanır; imparatorluğa yaptıkları büyük bir hizmet sonucunda soyluluk kazanmışlardır. Gemicilikte ustadırlar ve denizle olan bağları hâlâ güçlüdür; ancak ticaret konusunda Rosalin ya da Goldenteeth kadar incelikli değillerdir. Soylu geleneklere tam anlamıyla alışmış sayılmazlar; bu durum hem onları dışarıdan gelen gibi gösterir hem de daha özgür kılar. İmparatora bağlıdırlar, fakat ilk büyük hizmetlerinden sonra hep “sonradan gelen” olarak görülmüşlerdir. Yine de işler zorlaştığında, özellikle deniz ve savaş söz konusu olduğunda, sahneye çıkar ve görevlerini eksiksiz yerine getirirler.</w:t>
+        <w:t>Blackship ailesi, Aquamere’deki Blackfish hanesiyle aynı kökten gelen eski bir korsan ailesidir; iki kol kendi aralarındaki bir kavga yüzünden ayrılmış, imparatora daha sadık olan kısım Venture’a yerleşmiştir. Köken olarak eski korsanlara dayanırlar; imparatorluğa yaptıkları büyük bir hizmet sonucunda soyluluk kazanmışlardır. Gemicilikte ustadırlar ve denizle olan bağları hâlâ güçlüdür; ancak ticaret konusunda Rosalin ya da Goldenteeth kadar incelikli değillerdir. Soylu geleneklere tam anlamıyla alışmış sayılmazlar; bu durum hem onları dışarıdan gelen gibi gösterir hem de daha özgür kılar. İmparatora bağlıdırlar, fakat ilk büyük hizmetlerinden sonra hep “sonradan gelen” olarak görülmüşlerdir. Yine de işler zorlaştığında, özellikle deniz ve savaş söz konusu olduğunda, sahneye çıkar ve görevlerini eksiksiz yerine getirirler.</w:t>
       </w:r>
     </w:p>
     <w:p>
@@ -3112,7 +3112,7 @@
         <w:rPr>
           <w:rFonts w:ascii="Georgia" w:hAnsi="Georgia" w:cs="Georgia" w:eastAsia="Georgia"/>
         </w:rPr>
-        <w:t>Kökleri denizlerin tekinsiz sularında terör estiren eski korsanlara dayanan Blackfish hanesi, soyluluğu bir lütuf değil, savaş meydanında kopardıkları bir hak olarak görür. Zamanında kralı mutlak bir ölümden kurtardıkları için soyluluk unvanı almışlardır; bu nedenle şehirdeki "geleneksel" soylular tarafından sürekli hor görülürler. Saray adabından uzak, ağzı bozuk ve özgürlükçüdürler. Denizin kuralsız ruhunu taşıyan bu hane, diplomasi masasından çok fırtınalı bir denizde savaşmayı tercih eder.</w:t>
+        <w:t>Venture’daki Blackship ailesiyle aynı kökten gelen Blackfish hanesi, ailenin kendi köklerine sadık kalan koludur ve Aquamere’de kalmıştır. Kökleri denizlerin tekinsiz sularında terör estiren eski korsanlara dayanır; soyluluğu bir lütuf değil, savaş meydanında kopardıkları bir hak olarak görür. Zamanında kralı mutlak bir ölümden kurtardıkları için soyluluk unvanı almışlardır; bu nedenle şehirdeki "geleneksel" soylular tarafından sürekli hor görülürler. Saray adabından uzak, ağzı bozuk ve özgürlükçüdürler. Denizin kuralsız ruhunu taşıyan bu hane, diplomasi masasından çok fırtınalı bir denizde savaşmayı tercih eder.</w:t>
       </w:r>
     </w:p>
     <w:p>
@@ -3427,7 +3427,7 @@
         <w:rPr>
           <w:rFonts w:ascii="Georgia" w:hAnsi="Georgia" w:cs="Georgia" w:eastAsia="Georgia"/>
         </w:rPr>
-        <w:t>Archantus hanesi, isimlerini aldıkları Tanrı Arcan’ın soyundan geldiklerine inanılan, kentin ve imparatorluğun en kutsal, en kudretli büyücü ailelerinden biridir. Kanlarında sihrin en saf ve güçlü hâli akar; bu yüzden büyü, onlar için öğrenilen bir zanaattan ziyade taşıdıkları ilahi bir mirastır. Şehirdeki devasa Büyücü Okulu’nun yönetimi ve hocalık kademeleri büyük ölçüde onların elindedir. Büyüyü akademik bir ciddiyetle, kurallara ve kadim geleneklere bağlı kalarak icra ederler. İmparatorluğun büyüsel entelijansiyasını oluşturan bu aile, kulelerinden tüm diyarı izler ve yüksek büyü sanatını imparatorluğun görkemiyle eş tutar.</w:t>
+        <w:t>Archantus hanesi, Koran’ın evlilik yoluyla dâhil olduğu ve onun tanrılaşmasından sonra Tanrı Arcan’ın hanesi sayılan, kentin ve imparatorluğun en kutsal, en kudretli büyücü ailelerinden biridir. Kanlarında sihrin en saf ve güçlü hâli akar; bu yüzden büyü, onlar için öğrenilen bir zanaattan ziyade taşıdıkları ilahi bir mirastır. Şehirdeki devasa Büyücü Okulu’nun yönetimi ve hocalık kademeleri büyük ölçüde onların elindedir. Büyüyü akademik bir ciddiyetle, kurallara ve kadim geleneklere bağlı kalarak icra ederler. İmparatorluğun büyüsel entelijansiyasını oluşturan bu aile, kulelerinden tüm diyarı izler ve yüksek büyü sanatını imparatorluğun görkemiyle eş tutar.</w:t>
       </w:r>
     </w:p>
     <w:p>

</xml_diff>

<commit_message>
Remove repeated passages and fix typos
Co-Authored-By: Claude Sonnet 5.5 <noreply@anthropic.com>
Claude-Session: https://claude.ai/code/session_01JpcpLvtS7aJ4eQsGwHD4Tg
</commit_message>
<xml_diff>
--- a/docx/Carya_Imparatorluk.docx
+++ b/docx/Carya_Imparatorluk.docx
@@ -3112,7 +3112,7 @@
         <w:rPr>
           <w:rFonts w:ascii="Georgia" w:hAnsi="Georgia" w:cs="Georgia" w:eastAsia="Georgia"/>
         </w:rPr>
-        <w:t>Venture’daki Blackship ailesiyle aynı kökten gelen Blackfish hanesi, ailenin kendi köklerine sadık kalan koludur ve Aquamere’de kalmıştır. Kökleri denizlerin tekinsiz sularında terör estiren eski korsanlara dayanır; soyluluğu bir lütuf değil, savaş meydanında kopardıkları bir hak olarak görür. Zamanında kralı mutlak bir ölümden kurtardıkları için soyluluk unvanı almışlardır; bu nedenle şehirdeki "geleneksel" soylular tarafından sürekli hor görülürler. Saray adabından uzak, ağzı bozuk ve özgürlükçüdürler. Denizin kuralsız ruhunu taşıyan bu hane, diplomasi masasından çok fırtınalı bir denizde savaşmayı tercih eder.</w:t>
+        <w:t>Venture’daki Blackship ailesiyle aynı kökten gelen Blackfish hanesi, ailenin kendi köklerine sadık kalan koludur ve Aquamere’de kalmıştır. Kökleri denizlerin tekinsiz sularında terör estiren eski korsanlara dayanır; soyluluğu bir lütuf değil, savaş meydanında kopardıkları bir hak olarak görür. Zamanında kralı mutlak bir ölümden kurtardıkları için soyluluk unvanı almışlardır; bu nedenle şehirdeki “geleneksel” soylular tarafından sürekli hor görülürler. Saray adabından uzak, ağzı bozuk ve özgürlükçüdürler. Denizin kuralsız ruhunu taşıyan bu hane, diplomasi masasından çok fırtınalı bir denizde savaşmayı tercih eder.</w:t>
       </w:r>
     </w:p>
     <w:p>
@@ -3260,7 +3260,7 @@
         <w:rPr>
           <w:rFonts w:ascii="Georgia" w:hAnsi="Georgia" w:cs="Georgia" w:eastAsia="Georgia"/>
         </w:rPr>
-        <w:t>Aquamere şehrinin denize dönük yüzünün aksine, toprağa basan ayaklarıdır. Şehri çevreleyen kasabalarda devasa tarım arazilerini yönetir, Aquamere'in erzak ve erzak güvenliğini sağlarlar. İhtiraslı deniz maceralarından uzak duran bu aile, daha çok şehrin sıkıcı ama hayati olan bürokratik işleriyle ilgilenir. Aquamere hanesinin en büyük destekçisi konumundadırlar; kâğıt işlerini, vergi toplamayı ve gıda dağıtımını yönettikleri için şehrin gerçek çarkları onların elinde döner.</w:t>
+        <w:t>Aquamere şehrinin denize dönük yüzünün aksine, toprağa basan ayaklarıdır. Şehri çevreleyen kasabalarda devasa tarım arazilerini yönetir, Aquamere’in gıda ve erzak güvenliğini sağlarlar. İhtiraslı deniz maceralarından uzak duran bu aile, daha çok şehrin sıkıcı ama hayati olan bürokratik işleriyle ilgilenir. Aquamere hanesinin en büyük destekçisi konumundadırlar; kâğıt işlerini, vergi toplamayı ve gıda dağıtımını yönettikleri için şehrin gerçek çarkları onların elinde döner.</w:t>
       </w:r>
     </w:p>
     <w:p>
@@ -3501,7 +3501,7 @@
         <w:rPr>
           <w:rFonts w:ascii="Georgia" w:hAnsi="Georgia" w:cs="Georgia" w:eastAsia="Georgia"/>
         </w:rPr>
-        <w:t>Tıpkı Archantus gibi soylarında yoğun bir büyüsel güç barındıran Mystra ailesi, büyüyü kitaplardan okuyarak öğrenen "büyücülerden" (wizard) ziyade, bu gücü doğuştan içgüdüsel olarak kullanan "efsunculardan" (sorcerer) oluşur. Disiplinli ve kuralcı okul hayatı onlara göre değildir. Mystralar, büyücülerin daha fazla hakka, daha geniş bir hareket alanına ve özgürlüğe sahip olması gerektiğini açıkça savunur. Kulelere kapanmak yerine diyarı karış karış gezen, rüzgârın ve serbest sihrin peşinden giden gezgin büyücüleriyle ün salmışlardır. Bağımsız ruhları, zaman zaman kuralcı Archantus hanesiyle ters düşmelerine neden olur.</w:t>
+        <w:t>Tıpkı Archantus gibi soylarında yoğun bir büyüsel güç barındıran Mystra ailesi, büyüyü kitaplardan okuyarak öğrenen “büyücülerden” (wizard) ziyade, bu gücü doğuştan içgüdüsel olarak kullanan “efsunculardan” (sorcerer) oluşur. Disiplinli ve kuralcı okul hayatı onlara göre değildir. Mystralar, büyücülerin daha fazla hakka, daha geniş bir hareket alanına ve özgürlüğe sahip olması gerektiğini açıkça savunur. Kulelere kapanmak yerine diyarı karış karış gezen, rüzgârın ve serbest sihrin peşinden giden gezgin büyücüleriyle ün salmışlardır. Bağımsız ruhları, zaman zaman kuralcı Archantus hanesiyle ters düşmelerine neden olur.</w:t>
       </w:r>
     </w:p>
     <w:p>
@@ -3649,7 +3649,7 @@
         <w:rPr>
           <w:rFonts w:ascii="Georgia" w:hAnsi="Georgia" w:cs="Georgia" w:eastAsia="Georgia"/>
         </w:rPr>
-        <w:t>Bu hane için büyü, kibrin ya da gizemli araştırmaların bir aracı değil; doğrudan halka, topluma ve devlete hizmet etmesi gereken bir "iş aletidir." Kudretli büyücülerin dünyadan izole bir şekilde güç fantezileri kurmasına şiddetle karşı çıkarlar. Temel felsefeleri "az büyü, çok iş" üzerine kuruludur. Tarımı kolaylaştıran, hastaları iyileştiren ya da şehir altyapısını güçlendiren pratik sihirleri tercih ederler. Yönetimsel olarak Archantus ailesinin en sadık sağ kolu konumundadırlar. Şehirdeki diğer haneler onları Archantus'un "yalakaları" olarak küçümsese de, Annexila'nın tek amacı sıradan halkın yaşamını büyü yoluyla kolaylaştırmaktır.</w:t>
+        <w:t>Bu hane için büyü, kibrin ya da gizemli araştırmaların bir aracı değil; doğrudan halka, topluma ve devlete hizmet etmesi gereken bir “iş aletidir.” Kudretli büyücülerin dünyadan izole bir şekilde güç fantezileri kurmasına şiddetle karşı çıkarlar. Temel felsefeleri “az büyü, çok iş” üzerine kuruludur. Tarımı kolaylaştıran, hastaları iyileştiren ya da şehir altyapısını güçlendiren pratik sihirleri tercih ederler. Yönetimsel olarak Archantus ailesinin en sadık sağ kolu konumundadırlar. Şehirdeki diğer haneler onları Archantus’un “yalakaları” olarak küçümsese de, Annexila’nın tek amacı sıradan halkın yaşamını büyü yoluyla kolaylaştırmaktır.</w:t>
       </w:r>
     </w:p>
     <w:p>
@@ -3723,7 +3723,7 @@
         <w:rPr>
           <w:rFonts w:ascii="Georgia" w:hAnsi="Georgia" w:cs="Georgia" w:eastAsia="Georgia"/>
         </w:rPr>
-        <w:t>Aslen Aux kökenli olan Von Draken ailesi, İmparatorluk topraklarına sonradan dâhil olmuş ancak muazzam bir hızla uyum sağlamıştır. Büyü yapmaktan ziyade, büyüyle üretilmiş nadir materyallerin, sihirli eşyaların ve tılsımların tüccarlığını yaparak devasa bir servet inşa etmişlerdir. Diğer haneler onların İmparator’a ya da Arcan's Gate’e olan sadakatini her zaman sorgular; zira her kararlarının arkasında altın yatar. Aidiyetleri şüpheli olsa da, şehrin sunduğu imkânları ticari bir imparatorluğa dönüştürme konusunda diyarda onların üzerine yoktur.</w:t>
+        <w:t>Aslen Aux kökenli olan Von Draken ailesi, İmparatorluk topraklarına sonradan dâhil olmuş ancak muazzam bir hızla uyum sağlamıştır. Büyü yapmaktan ziyade, büyüyle üretilmiş nadir materyallerin, sihirli eşyaların ve tılsımların tüccarlığını yaparak devasa bir servet inşa etmişlerdir. Diğer haneler onların İmparator’a ya da Arcan’s Gate’e olan sadakatini her zaman sorgular; zira her kararlarının arkasında altın yatar. Aidiyetleri şüpheli olsa da, şehrin sunduğu imkânları ticari bir imparatorluğa dönüştürme konusunda diyarda onların üzerine yoktur.</w:t>
       </w:r>
     </w:p>
     <w:p>
@@ -3797,7 +3797,7 @@
         <w:rPr>
           <w:rFonts w:ascii="Georgia" w:hAnsi="Georgia" w:cs="Georgia" w:eastAsia="Georgia"/>
         </w:rPr>
-        <w:t>Çok eski çağlarda Aux'taki dini baskılardan ve uyumsuzluklardan kaçarak İmparatorluğa sığınan bu aile, ilk birkaç yüzyıl boyunca farklı kültürleri ve inançları nedeniyle hep dışlanmış ve sorgulanmıştır. Ancak zamanla hayatta kalma güdüsüyle radikal bir dönüşüm geçirmiş, Yeryüzü Tapınağı'nı herkesten çok benimsemiş ve bu yeni inançta sergiledikleri yobazlıkla ün salmışlardır. Günümüzde şehirdeki diğer aileler tarafından sinsi ve fazlasıyla tehlikeli bulunurlar; ancak İmparatorluk, La Seraphine hanesini bilerek orada tutar. Çünkü güç kazanmak için rakiplerinin en ufak dini ya da yasal hatasını kollayan bu aile, Arcan's Gate’in başına buyruk büyücülerini dizginleyen mükemmel bir güvenlik sübabıdır.</w:t>
+        <w:t>Çok eski çağlarda Aux’taki dini baskılardan ve uyumsuzluklardan kaçarak İmparatorluğa sığınan bu aile, ilk birkaç yüzyıl boyunca farklı kültürleri ve inançları nedeniyle hep dışlanmış ve sorgulanmıştır. Ancak zamanla hayatta kalma güdüsüyle radikal bir dönüşüm geçirmiş, Yeryüzü Tapınağı’nı herkesten çok benimsemiş ve bu yeni inançta sergiledikleri yobazlıkla ün salmışlardır. Günümüzde şehirdeki diğer aileler tarafından sinsi ve fazlasıyla tehlikeli bulunurlar; ancak İmparatorluk, La Seraphine hanesini bilerek orada tutar. Çünkü güç kazanmak için rakiplerinin en ufak dini ya da yasal hatasını kollayan bu aile, Arcan’s Gate’in başına buyruk büyücülerini dizginleyen mükemmel bir güvenlik sübabıdır.</w:t>
       </w:r>
     </w:p>
     <w:p>
@@ -3890,7 +3890,7 @@
         <w:rPr>
           <w:rFonts w:ascii="Georgia" w:hAnsi="Georgia" w:cs="Georgia" w:eastAsia="Georgia"/>
         </w:rPr>
-        <w:t>Greenhall ailesi, İmparatorluk'un en yeni yöneticilerinden biri olmasına rağmen, kökenlerindeki Florentina ve Corvus akrabalığı sayesinde şüphe götürmez bir meşruiyete sahiptir. "Greenhall Projesi" olarak bilinen bu tehlikeli sınır yerleşiminin inşasını ve yönetimini üstlenerek şehre kendi isimlerini vermişlerdir. Kıyısı olmayan, ticaretin tehlikeli kırsaldan geçtiği ve yerel "yeşilderili" halkların şehir içinde yaşamasına müsaade edilen bu kaotik bölgeyi yönetmek devasa bir sınavdır. Mühendislik dehaları, askeri disiplinleri ve yöneticilik yetenekleriyle bu zorlu görevin altından kalkmaya çalışırlar. Diğer lordlardan toplanan vergilerin doğrudan bu projeye aktarılması onları diyardaki kıskançlıkların hedefi yapsa da, arkalarındaki Florentina kanı ve sarsılmaz imparatorluk sadakati, herkesi hizaya sokan yegâne kalkanlarıdır.</w:t>
+        <w:t>Greenhall ailesi, İmparatorluk’un en yeni yöneticilerinden biri olmasına rağmen, kökenlerindeki Florentina ve Corvus akrabalığı sayesinde şüphe götürmez bir meşruiyete sahiptir. “Greenhall Projesi” olarak bilinen bu tehlikeli sınır yerleşiminin inşasını ve yönetimini üstlenerek şehre kendi isimlerini vermişlerdir. Kıyısı olmayan, ticaretin tehlikeli kırsaldan geçtiği ve yerel “yeşilderili” halkların şehir içinde yaşamasına müsaade edilen bu kaotik bölgeyi yönetmek devasa bir sınavdır. Mühendislik dehaları, askeri disiplinleri ve yöneticilik yetenekleriyle bu zorlu görevin altından kalkmaya çalışırlar. Diğer lordlardan toplanan vergilerin doğrudan bu projeye aktarılması onları diyardaki kıskançlıkların hedefi yapsa da, arkalarındaki Florentina kanı ve sarsılmaz imparatorluk sadakati, herkesi hizaya sokan yegâne kalkanlarıdır.</w:t>
       </w:r>
     </w:p>
     <w:p>
@@ -3964,7 +3964,7 @@
         <w:rPr>
           <w:rFonts w:ascii="Georgia" w:hAnsi="Georgia" w:cs="Georgia" w:eastAsia="Georgia"/>
         </w:rPr>
-        <w:t>Aslen Başkent'ten gelen ve nesiller boyu ordunun en üst kademelerinde görev yapmış katı, kuralcı ve tavizsiz bir asker ailesidir. Greenhall şehrinin askeri belkemiğini oluşturmaları için buraya bizzat yerleştirilmişlerdir. Greenhall hanesinin yeşilderililerle kurmaya çalıştığı entegrasyon politikalarına sıcak bakmazlar; onlar için sınır demek, ötekini dışarıda tutmak demektir. Hoşgörüsüz ve sert yapılarına rağmen, şehrin vahşi doğaya ve olası saldırılara karşı hayatta kalmasını sağlayan yegâne askeri güç oldukları için kimse onların üzerine gidemez.</w:t>
+        <w:t>Aslen Başkent’ten gelen ve nesiller boyu ordunun en üst kademelerinde görev yapmış katı, kuralcı ve tavizsiz bir asker ailesidir. Greenhall şehrinin askeri belkemiğini oluşturmaları için buraya bizzat yerleştirilmişlerdir. Greenhall hanesinin yeşilderililerle kurmaya çalıştığı entegrasyon politikalarına sıcak bakmazlar; onlar için sınır demek, ötekini dışarıda tutmak demektir. Hoşgörüsüz ve sert yapılarına rağmen, şehrin vahşi doğaya ve olası saldırılara karşı hayatta kalmasını sağlayan yegâne askeri güç oldukları için kimse onların üzerine gidemez.</w:t>
       </w:r>
     </w:p>
     <w:p>
@@ -4038,7 +4038,7 @@
         <w:rPr>
           <w:rFonts w:ascii="Georgia" w:hAnsi="Georgia" w:cs="Georgia" w:eastAsia="Georgia"/>
         </w:rPr>
-        <w:t>Daha önce Aquamere şehrinin kozmopolit yapısında tecrübe kazanmış olan Slezk ailesi, o çok kültürlü deneyimi alıp Greenhall’un bürokratik ve dini işlerini yönetmesi için buraya gönderilmiştir. Dışarıdan bakıldığında barışçıl ve hoşgörülü bir bürokrat hanesi gibi görünürler; ancak bu yumuşak yüzeyin altında katı bir misyonerlik zihniyeti yatar. Onların nihai amacı, bölgedeki yeşilderili halkları birer araç olarak kullanmak ve onları kendi köklü inançları olan "Gork ve Morg"dan kopararak İmparatorluğun resmî inancı olan Yeryüzü İnancı’na geçirmektir. Slezklere göre bir yeşilderilinin ruhu ancak İmparatorluğun dinine biat ettiğinde kurtulabilir; bu yüzden hoşgörüleri aslında bir asimilasyon silahıdır.</w:t>
+        <w:t>Daha önce Aquamere şehrinin kozmopolit yapısında tecrübe kazanmış olan Slezk ailesi, o çok kültürlü deneyimi alıp Greenhall’un bürokratik ve dini işlerini yönetmesi için buraya gönderilmiştir. Dışarıdan bakıldığında barışçıl ve hoşgörülü bir bürokrat hanesi gibi görünürler; ancak bu yumuşak yüzeyin altında katı bir misyonerlik zihniyeti yatar. Onların nihai amacı, bölgedeki yeşilderili halkları birer araç olarak kullanmak ve onları kendi köklü inançları olan “Gork ve Morg”dan kopararak İmparatorluğun resmî inancı olan Yeryüzü İnancı’na geçirmektir. Slezklere göre bir yeşilderilinin ruhu ancak İmparatorluğun dinine biat ettiğinde kurtulabilir; bu yüzden hoşgörüleri aslında bir asimilasyon silahıdır.</w:t>
       </w:r>
     </w:p>
     <w:sectPr>

</xml_diff>

<commit_message>
Remove underwater races; list green-skinned peoples
Co-Authored-By: Claude Sonnet 5.5 <noreply@anthropic.com>
Claude-Session: https://claude.ai/code/session_01JpcpLvtS7aJ4eQsGwHD4Tg
</commit_message>
<xml_diff>
--- a/docx/Carya_Imparatorluk.docx
+++ b/docx/Carya_Imparatorluk.docx
@@ -645,7 +645,7 @@
         <w:rPr>
           <w:rFonts w:ascii="Georgia" w:hAnsi="Georgia" w:cs="Georgia" w:eastAsia="Georgia"/>
         </w:rPr>
-        <w:t>Nüfusun önemli bir bölümünü su altı kökenli ırklar oluşturur. Bu topluluklar yüzyıllar boyunca insanlarla birlikte yaşamış ve karma bir kültür ortaya çıkmıştır. Bu durum, mimariden gündelik yaşama kadar pek çok alanda kendini gösterir.</w:t>
+        <w:t>Nüfusun önemli bir bölümü denizle geçinen, farklı kıyı ve adalardan gelmiş halklardan oluşur. Bu topluluklar yüzyıllar boyunca bir arada yaşamış ve karma bir kültür ortaya çıkmıştır. Bu durum, mimariden gündelik yaşama kadar pek çok alanda kendini gösterir.</w:t>
       </w:r>
     </w:p>
     <w:p>
@@ -3038,7 +3038,7 @@
         <w:rPr>
           <w:rFonts w:ascii="Georgia" w:hAnsi="Georgia" w:cs="Georgia" w:eastAsia="Georgia"/>
         </w:rPr>
-        <w:t>Şehre adını veren Aquamere ailesi, bu coğrafyanın en kadim sakinleridir ve Florentina Hanedanı’nın denizlerdeki mutlak hâkimiyetini kurmasına tarihi bir destek sağlamışlardır. Şehirdeki en imparatorluk yanlısı aile onlardır. Aslında kendi refahlarını büyütmekten çok, limandaki diğer başına buyruk haneleri dizginlemek, su altı halklarıyla dengeyi korumak ve Aquamere’i İmparatorluğun güvenilir bir çapası olarak tutmak için bütün mesailerini harcarlar. İhtişamlı görünürler ancak omuzlarındaki idari yük oldukça ağırdır.</w:t>
+        <w:t>Şehre adını veren Aquamere ailesi, bu coğrafyanın en kadim sakinleridir ve Florentina Hanedanı’nın denizlerdeki mutlak hâkimiyetini kurmasına tarihi bir destek sağlamışlardır. Şehirdeki en imparatorluk yanlısı aile onlardır. Aslında kendi refahlarını büyütmekten çok, limandaki diğer başına buyruk haneleri dizginlemek, farklı kıyı halklarıyla dengeyi korumak ve Aquamere’i İmparatorluğun güvenilir bir çapası olarak tutmak için bütün mesailerini harcarlar. İhtişamlı görünürler ancak omuzlarındaki idari yük oldukça ağırdır.</w:t>
       </w:r>
     </w:p>
     <w:p>

</xml_diff>

<commit_message>
Use the new approved arms in Carya_Imparatorluk.docx
Each noble house in soylu_aileler.md now points to its regenerated arms
(cut out from the parchment background, 360 px), and the Word document
is rebuilt with docx_olustur.py.

Co-Authored-By: Claude Opus 5.5 <noreply@anthropic.com>
Claude-Session: https://claude.ai/code/session_01Mfzr2E3Ey9o3G5KUSC6GaD
</commit_message>
<xml_diff>
--- a/docx/Carya_Imparatorluk.docx
+++ b/docx/Carya_Imparatorluk.docx
@@ -1436,7 +1436,7 @@
       <w:r>
         <w:drawing>
           <wp:inline xmlns:a="http://schemas.openxmlformats.org/drawingml/2006/main" xmlns:pic="http://schemas.openxmlformats.org/drawingml/2006/picture">
-            <wp:extent cx="1080000" cy="1080000"/>
+            <wp:extent cx="1080000" cy="1403610"/>
             <wp:docPr id="7" name="Florentina" descr="Florentina"/>
             <wp:cNvGraphicFramePr>
               <a:graphicFrameLocks noChangeAspect="1"/>
@@ -1445,11 +1445,11 @@
               <a:graphicData uri="http://schemas.openxmlformats.org/drawingml/2006/picture">
                 <pic:pic>
                   <pic:nvPicPr>
-                    <pic:cNvPr id="0" name="image.png"/>
+                    <pic:cNvPr id="0" name="arma_Florentina.png"/>
                     <pic:cNvPicPr/>
                   </pic:nvPicPr>
                   <pic:blipFill>
-                    <a:blip r:embed="rId10"/>
+                    <a:blip r:embed="rId16"/>
                     <a:stretch>
                       <a:fillRect/>
                     </a:stretch>
@@ -1457,7 +1457,7 @@
                   <pic:spPr>
                     <a:xfrm>
                       <a:off x="0" y="0"/>
-                      <a:ext cx="1080000" cy="1080000"/>
+                      <a:ext cx="1080000" cy="1403610"/>
                     </a:xfrm>
                     <a:prstGeom prst="rect"/>
                   </pic:spPr>
@@ -1534,7 +1534,7 @@
       <w:r>
         <w:drawing>
           <wp:inline xmlns:a="http://schemas.openxmlformats.org/drawingml/2006/main" xmlns:pic="http://schemas.openxmlformats.org/drawingml/2006/picture">
-            <wp:extent cx="1080000" cy="1080000"/>
+            <wp:extent cx="1080000" cy="1456180"/>
             <wp:docPr id="8" name="Corvus" descr="Corvus"/>
             <wp:cNvGraphicFramePr>
               <a:graphicFrameLocks noChangeAspect="1"/>
@@ -1543,11 +1543,11 @@
               <a:graphicData uri="http://schemas.openxmlformats.org/drawingml/2006/picture">
                 <pic:pic>
                   <pic:nvPicPr>
-                    <pic:cNvPr id="0" name="image.png"/>
+                    <pic:cNvPr id="0" name="arma_Corvus.png"/>
                     <pic:cNvPicPr/>
                   </pic:nvPicPr>
                   <pic:blipFill>
-                    <a:blip r:embed="rId16"/>
+                    <a:blip r:embed="rId17"/>
                     <a:stretch>
                       <a:fillRect/>
                     </a:stretch>
@@ -1555,7 +1555,7 @@
                   <pic:spPr>
                     <a:xfrm>
                       <a:off x="0" y="0"/>
-                      <a:ext cx="1080000" cy="1080000"/>
+                      <a:ext cx="1080000" cy="1456180"/>
                     </a:xfrm>
                     <a:prstGeom prst="rect"/>
                   </pic:spPr>
@@ -1608,7 +1608,7 @@
       <w:r>
         <w:drawing>
           <wp:inline xmlns:a="http://schemas.openxmlformats.org/drawingml/2006/main" xmlns:pic="http://schemas.openxmlformats.org/drawingml/2006/picture">
-            <wp:extent cx="1080000" cy="1080000"/>
+            <wp:extent cx="1080000" cy="1317966"/>
             <wp:docPr id="9" name="De Santis" descr="De Santis"/>
             <wp:cNvGraphicFramePr>
               <a:graphicFrameLocks noChangeAspect="1"/>
@@ -1617,11 +1617,11 @@
               <a:graphicData uri="http://schemas.openxmlformats.org/drawingml/2006/picture">
                 <pic:pic>
                   <pic:nvPicPr>
-                    <pic:cNvPr id="0" name="image.png"/>
+                    <pic:cNvPr id="0" name="arma_De_Santis.png"/>
                     <pic:cNvPicPr/>
                   </pic:nvPicPr>
                   <pic:blipFill>
-                    <a:blip r:embed="rId17"/>
+                    <a:blip r:embed="rId18"/>
                     <a:stretch>
                       <a:fillRect/>
                     </a:stretch>
@@ -1629,7 +1629,7 @@
                   <pic:spPr>
                     <a:xfrm>
                       <a:off x="0" y="0"/>
-                      <a:ext cx="1080000" cy="1080000"/>
+                      <a:ext cx="1080000" cy="1317966"/>
                     </a:xfrm>
                     <a:prstGeom prst="rect"/>
                   </pic:spPr>
@@ -1682,7 +1682,7 @@
       <w:r>
         <w:drawing>
           <wp:inline xmlns:a="http://schemas.openxmlformats.org/drawingml/2006/main" xmlns:pic="http://schemas.openxmlformats.org/drawingml/2006/picture">
-            <wp:extent cx="1080000" cy="1080000"/>
+            <wp:extent cx="1080000" cy="1336082"/>
             <wp:docPr id="10" name="La Cruix" descr="La Cruix"/>
             <wp:cNvGraphicFramePr>
               <a:graphicFrameLocks noChangeAspect="1"/>
@@ -1691,11 +1691,11 @@
               <a:graphicData uri="http://schemas.openxmlformats.org/drawingml/2006/picture">
                 <pic:pic>
                   <pic:nvPicPr>
-                    <pic:cNvPr id="0" name="image.png"/>
+                    <pic:cNvPr id="0" name="arma_La_Cruix.png"/>
                     <pic:cNvPicPr/>
                   </pic:nvPicPr>
                   <pic:blipFill>
-                    <a:blip r:embed="rId18"/>
+                    <a:blip r:embed="rId19"/>
                     <a:stretch>
                       <a:fillRect/>
                     </a:stretch>
@@ -1703,7 +1703,7 @@
                   <pic:spPr>
                     <a:xfrm>
                       <a:off x="0" y="0"/>
-                      <a:ext cx="1080000" cy="1080000"/>
+                      <a:ext cx="1080000" cy="1336082"/>
                     </a:xfrm>
                     <a:prstGeom prst="rect"/>
                   </pic:spPr>
@@ -1756,7 +1756,7 @@
       <w:r>
         <w:drawing>
           <wp:inline xmlns:a="http://schemas.openxmlformats.org/drawingml/2006/main" xmlns:pic="http://schemas.openxmlformats.org/drawingml/2006/picture">
-            <wp:extent cx="1080000" cy="1080000"/>
+            <wp:extent cx="1080000" cy="1506977"/>
             <wp:docPr id="11" name="Strazni" descr="Strazni"/>
             <wp:cNvGraphicFramePr>
               <a:graphicFrameLocks noChangeAspect="1"/>
@@ -1765,11 +1765,11 @@
               <a:graphicData uri="http://schemas.openxmlformats.org/drawingml/2006/picture">
                 <pic:pic>
                   <pic:nvPicPr>
-                    <pic:cNvPr id="0" name="image.png"/>
+                    <pic:cNvPr id="0" name="arma_Strazni.png"/>
                     <pic:cNvPicPr/>
                   </pic:nvPicPr>
                   <pic:blipFill>
-                    <a:blip r:embed="rId19"/>
+                    <a:blip r:embed="rId20"/>
                     <a:stretch>
                       <a:fillRect/>
                     </a:stretch>
@@ -1777,7 +1777,7 @@
                   <pic:spPr>
                     <a:xfrm>
                       <a:off x="0" y="0"/>
-                      <a:ext cx="1080000" cy="1080000"/>
+                      <a:ext cx="1080000" cy="1506977"/>
                     </a:xfrm>
                     <a:prstGeom prst="rect"/>
                   </pic:spPr>
@@ -1830,7 +1830,7 @@
       <w:r>
         <w:drawing>
           <wp:inline xmlns:a="http://schemas.openxmlformats.org/drawingml/2006/main" xmlns:pic="http://schemas.openxmlformats.org/drawingml/2006/picture">
-            <wp:extent cx="1080000" cy="1080000"/>
+            <wp:extent cx="1080000" cy="1309091"/>
             <wp:docPr id="12" name="Visconty" descr="Visconty"/>
             <wp:cNvGraphicFramePr>
               <a:graphicFrameLocks noChangeAspect="1"/>
@@ -1839,11 +1839,11 @@
               <a:graphicData uri="http://schemas.openxmlformats.org/drawingml/2006/picture">
                 <pic:pic>
                   <pic:nvPicPr>
-                    <pic:cNvPr id="0" name="image.png"/>
+                    <pic:cNvPr id="0" name="arma_Visconty.png"/>
                     <pic:cNvPicPr/>
                   </pic:nvPicPr>
                   <pic:blipFill>
-                    <a:blip r:embed="rId20"/>
+                    <a:blip r:embed="rId21"/>
                     <a:stretch>
                       <a:fillRect/>
                     </a:stretch>
@@ -1851,7 +1851,7 @@
                   <pic:spPr>
                     <a:xfrm>
                       <a:off x="0" y="0"/>
-                      <a:ext cx="1080000" cy="1080000"/>
+                      <a:ext cx="1080000" cy="1309091"/>
                     </a:xfrm>
                     <a:prstGeom prst="rect"/>
                   </pic:spPr>
@@ -1904,7 +1904,7 @@
       <w:r>
         <w:drawing>
           <wp:inline xmlns:a="http://schemas.openxmlformats.org/drawingml/2006/main" xmlns:pic="http://schemas.openxmlformats.org/drawingml/2006/picture">
-            <wp:extent cx="1080000" cy="1080000"/>
+            <wp:extent cx="1080000" cy="1326962"/>
             <wp:docPr id="13" name="Kellen" descr="Kellen"/>
             <wp:cNvGraphicFramePr>
               <a:graphicFrameLocks noChangeAspect="1"/>
@@ -1913,11 +1913,11 @@
               <a:graphicData uri="http://schemas.openxmlformats.org/drawingml/2006/picture">
                 <pic:pic>
                   <pic:nvPicPr>
-                    <pic:cNvPr id="0" name="image.png"/>
+                    <pic:cNvPr id="0" name="arma_Kellen.png"/>
                     <pic:cNvPicPr/>
                   </pic:nvPicPr>
                   <pic:blipFill>
-                    <a:blip r:embed="rId21"/>
+                    <a:blip r:embed="rId22"/>
                     <a:stretch>
                       <a:fillRect/>
                     </a:stretch>
@@ -1925,7 +1925,7 @@
                   <pic:spPr>
                     <a:xfrm>
                       <a:off x="0" y="0"/>
-                      <a:ext cx="1080000" cy="1080000"/>
+                      <a:ext cx="1080000" cy="1326962"/>
                     </a:xfrm>
                     <a:prstGeom prst="rect"/>
                   </pic:spPr>
@@ -1978,7 +1978,7 @@
       <w:r>
         <w:drawing>
           <wp:inline xmlns:a="http://schemas.openxmlformats.org/drawingml/2006/main" xmlns:pic="http://schemas.openxmlformats.org/drawingml/2006/picture">
-            <wp:extent cx="1080000" cy="1080000"/>
+            <wp:extent cx="1080000" cy="1309091"/>
             <wp:docPr id="14" name="Arsivanus" descr="Arsivanus"/>
             <wp:cNvGraphicFramePr>
               <a:graphicFrameLocks noChangeAspect="1"/>
@@ -1987,11 +1987,11 @@
               <a:graphicData uri="http://schemas.openxmlformats.org/drawingml/2006/picture">
                 <pic:pic>
                   <pic:nvPicPr>
-                    <pic:cNvPr id="0" name="image.png"/>
+                    <pic:cNvPr id="0" name="arma_Arsivanus.png"/>
                     <pic:cNvPicPr/>
                   </pic:nvPicPr>
                   <pic:blipFill>
-                    <a:blip r:embed="rId22"/>
+                    <a:blip r:embed="rId23"/>
                     <a:stretch>
                       <a:fillRect/>
                     </a:stretch>
@@ -1999,7 +1999,7 @@
                   <pic:spPr>
                     <a:xfrm>
                       <a:off x="0" y="0"/>
-                      <a:ext cx="1080000" cy="1080000"/>
+                      <a:ext cx="1080000" cy="1309091"/>
                     </a:xfrm>
                     <a:prstGeom prst="rect"/>
                   </pic:spPr>
@@ -2071,7 +2071,7 @@
       <w:r>
         <w:drawing>
           <wp:inline xmlns:a="http://schemas.openxmlformats.org/drawingml/2006/main" xmlns:pic="http://schemas.openxmlformats.org/drawingml/2006/picture">
-            <wp:extent cx="1080000" cy="1080000"/>
+            <wp:extent cx="1080000" cy="1359441"/>
             <wp:docPr id="15" name="Venture" descr="Venture"/>
             <wp:cNvGraphicFramePr>
               <a:graphicFrameLocks noChangeAspect="1"/>
@@ -2080,11 +2080,11 @@
               <a:graphicData uri="http://schemas.openxmlformats.org/drawingml/2006/picture">
                 <pic:pic>
                   <pic:nvPicPr>
-                    <pic:cNvPr id="0" name="image.png"/>
+                    <pic:cNvPr id="0" name="arma_Venture.png"/>
                     <pic:cNvPicPr/>
                   </pic:nvPicPr>
                   <pic:blipFill>
-                    <a:blip r:embed="rId12"/>
+                    <a:blip r:embed="rId24"/>
                     <a:stretch>
                       <a:fillRect/>
                     </a:stretch>
@@ -2092,7 +2092,7 @@
                   <pic:spPr>
                     <a:xfrm>
                       <a:off x="0" y="0"/>
-                      <a:ext cx="1080000" cy="1080000"/>
+                      <a:ext cx="1080000" cy="1359441"/>
                     </a:xfrm>
                     <a:prstGeom prst="rect"/>
                   </pic:spPr>
@@ -2145,7 +2145,7 @@
       <w:r>
         <w:drawing>
           <wp:inline xmlns:a="http://schemas.openxmlformats.org/drawingml/2006/main" xmlns:pic="http://schemas.openxmlformats.org/drawingml/2006/picture">
-            <wp:extent cx="1080000" cy="1080000"/>
+            <wp:extent cx="1080000" cy="1304698"/>
             <wp:docPr id="16" name="Von Zarovich" descr="Von Zarovich"/>
             <wp:cNvGraphicFramePr>
               <a:graphicFrameLocks noChangeAspect="1"/>
@@ -2154,11 +2154,11 @@
               <a:graphicData uri="http://schemas.openxmlformats.org/drawingml/2006/picture">
                 <pic:pic>
                   <pic:nvPicPr>
-                    <pic:cNvPr id="0" name="image.png"/>
+                    <pic:cNvPr id="0" name="arma_Von_Zarovich.png"/>
                     <pic:cNvPicPr/>
                   </pic:nvPicPr>
                   <pic:blipFill>
-                    <a:blip r:embed="rId23"/>
+                    <a:blip r:embed="rId25"/>
                     <a:stretch>
                       <a:fillRect/>
                     </a:stretch>
@@ -2166,7 +2166,7 @@
                   <pic:spPr>
                     <a:xfrm>
                       <a:off x="0" y="0"/>
-                      <a:ext cx="1080000" cy="1080000"/>
+                      <a:ext cx="1080000" cy="1304698"/>
                     </a:xfrm>
                     <a:prstGeom prst="rect"/>
                   </pic:spPr>
@@ -2219,7 +2219,7 @@
       <w:r>
         <w:drawing>
           <wp:inline xmlns:a="http://schemas.openxmlformats.org/drawingml/2006/main" xmlns:pic="http://schemas.openxmlformats.org/drawingml/2006/picture">
-            <wp:extent cx="1080000" cy="1080000"/>
+            <wp:extent cx="1080000" cy="1369014"/>
             <wp:docPr id="17" name="Rosalin" descr="Rosalin"/>
             <wp:cNvGraphicFramePr>
               <a:graphicFrameLocks noChangeAspect="1"/>
@@ -2228,11 +2228,11 @@
               <a:graphicData uri="http://schemas.openxmlformats.org/drawingml/2006/picture">
                 <pic:pic>
                   <pic:nvPicPr>
-                    <pic:cNvPr id="0" name="image.png"/>
+                    <pic:cNvPr id="0" name="arma_Rosalin.png"/>
                     <pic:cNvPicPr/>
                   </pic:nvPicPr>
                   <pic:blipFill>
-                    <a:blip r:embed="rId24"/>
+                    <a:blip r:embed="rId26"/>
                     <a:stretch>
                       <a:fillRect/>
                     </a:stretch>
@@ -2240,7 +2240,7 @@
                   <pic:spPr>
                     <a:xfrm>
                       <a:off x="0" y="0"/>
-                      <a:ext cx="1080000" cy="1080000"/>
+                      <a:ext cx="1080000" cy="1369014"/>
                     </a:xfrm>
                     <a:prstGeom prst="rect"/>
                   </pic:spPr>
@@ -2293,7 +2293,7 @@
       <w:r>
         <w:drawing>
           <wp:inline xmlns:a="http://schemas.openxmlformats.org/drawingml/2006/main" xmlns:pic="http://schemas.openxmlformats.org/drawingml/2006/picture">
-            <wp:extent cx="1080000" cy="1080000"/>
+            <wp:extent cx="1080000" cy="1336082"/>
             <wp:docPr id="18" name="Goldenteeth" descr="Goldenteeth"/>
             <wp:cNvGraphicFramePr>
               <a:graphicFrameLocks noChangeAspect="1"/>
@@ -2302,11 +2302,11 @@
               <a:graphicData uri="http://schemas.openxmlformats.org/drawingml/2006/picture">
                 <pic:pic>
                   <pic:nvPicPr>
-                    <pic:cNvPr id="0" name="image.png"/>
+                    <pic:cNvPr id="0" name="arma_Goldenteeth.png"/>
                     <pic:cNvPicPr/>
                   </pic:nvPicPr>
                   <pic:blipFill>
-                    <a:blip r:embed="rId25"/>
+                    <a:blip r:embed="rId27"/>
                     <a:stretch>
                       <a:fillRect/>
                     </a:stretch>
@@ -2314,7 +2314,7 @@
                   <pic:spPr>
                     <a:xfrm>
                       <a:off x="0" y="0"/>
-                      <a:ext cx="1080000" cy="1080000"/>
+                      <a:ext cx="1080000" cy="1336082"/>
                     </a:xfrm>
                     <a:prstGeom prst="rect"/>
                   </pic:spPr>
@@ -2367,7 +2367,7 @@
       <w:r>
         <w:drawing>
           <wp:inline xmlns:a="http://schemas.openxmlformats.org/drawingml/2006/main" xmlns:pic="http://schemas.openxmlformats.org/drawingml/2006/picture">
-            <wp:extent cx="1080000" cy="1080000"/>
+            <wp:extent cx="1080000" cy="1408696"/>
             <wp:docPr id="19" name="Ispwich" descr="Ispwich"/>
             <wp:cNvGraphicFramePr>
               <a:graphicFrameLocks noChangeAspect="1"/>
@@ -2376,11 +2376,11 @@
               <a:graphicData uri="http://schemas.openxmlformats.org/drawingml/2006/picture">
                 <pic:pic>
                   <pic:nvPicPr>
-                    <pic:cNvPr id="0" name="image.png"/>
+                    <pic:cNvPr id="0" name="arma_Ispwich.png"/>
                     <pic:cNvPicPr/>
                   </pic:nvPicPr>
                   <pic:blipFill>
-                    <a:blip r:embed="rId26"/>
+                    <a:blip r:embed="rId28"/>
                     <a:stretch>
                       <a:fillRect/>
                     </a:stretch>
@@ -2388,7 +2388,7 @@
                   <pic:spPr>
                     <a:xfrm>
                       <a:off x="0" y="0"/>
-                      <a:ext cx="1080000" cy="1080000"/>
+                      <a:ext cx="1080000" cy="1408696"/>
                     </a:xfrm>
                     <a:prstGeom prst="rect"/>
                   </pic:spPr>
@@ -2441,7 +2441,7 @@
       <w:r>
         <w:drawing>
           <wp:inline xmlns:a="http://schemas.openxmlformats.org/drawingml/2006/main" xmlns:pic="http://schemas.openxmlformats.org/drawingml/2006/picture">
-            <wp:extent cx="1080000" cy="1075500"/>
+            <wp:extent cx="1080000" cy="1317966"/>
             <wp:docPr id="20" name="Blackship" descr="Blackship"/>
             <wp:cNvGraphicFramePr>
               <a:graphicFrameLocks noChangeAspect="1"/>
@@ -2450,11 +2450,11 @@
               <a:graphicData uri="http://schemas.openxmlformats.org/drawingml/2006/picture">
                 <pic:pic>
                   <pic:nvPicPr>
-                    <pic:cNvPr id="0" name="image.png"/>
+                    <pic:cNvPr id="0" name="arma_Blackship.png"/>
                     <pic:cNvPicPr/>
                   </pic:nvPicPr>
                   <pic:blipFill>
-                    <a:blip r:embed="rId27"/>
+                    <a:blip r:embed="rId29"/>
                     <a:stretch>
                       <a:fillRect/>
                     </a:stretch>
@@ -2462,7 +2462,7 @@
                   <pic:spPr>
                     <a:xfrm>
                       <a:off x="0" y="0"/>
-                      <a:ext cx="1080000" cy="1075500"/>
+                      <a:ext cx="1080000" cy="1317966"/>
                     </a:xfrm>
                     <a:prstGeom prst="rect"/>
                   </pic:spPr>
@@ -2534,7 +2534,7 @@
       <w:r>
         <w:drawing>
           <wp:inline xmlns:a="http://schemas.openxmlformats.org/drawingml/2006/main" xmlns:pic="http://schemas.openxmlformats.org/drawingml/2006/picture">
-            <wp:extent cx="1080000" cy="1080000"/>
+            <wp:extent cx="1080000" cy="1640506"/>
             <wp:docPr id="21" name="Serenquill" descr="Serenquill"/>
             <wp:cNvGraphicFramePr>
               <a:graphicFrameLocks noChangeAspect="1"/>
@@ -2543,11 +2543,11 @@
               <a:graphicData uri="http://schemas.openxmlformats.org/drawingml/2006/picture">
                 <pic:pic>
                   <pic:nvPicPr>
-                    <pic:cNvPr id="0" name="image.png"/>
+                    <pic:cNvPr id="0" name="arma_Serenquill.png"/>
                     <pic:cNvPicPr/>
                   </pic:nvPicPr>
                   <pic:blipFill>
-                    <a:blip r:embed="rId11"/>
+                    <a:blip r:embed="rId30"/>
                     <a:stretch>
                       <a:fillRect/>
                     </a:stretch>
@@ -2555,7 +2555,7 @@
                   <pic:spPr>
                     <a:xfrm>
                       <a:off x="0" y="0"/>
-                      <a:ext cx="1080000" cy="1080000"/>
+                      <a:ext cx="1080000" cy="1640506"/>
                     </a:xfrm>
                     <a:prstGeom prst="rect"/>
                   </pic:spPr>
@@ -2608,7 +2608,7 @@
       <w:r>
         <w:drawing>
           <wp:inline xmlns:a="http://schemas.openxmlformats.org/drawingml/2006/main" xmlns:pic="http://schemas.openxmlformats.org/drawingml/2006/picture">
-            <wp:extent cx="1080000" cy="1080000"/>
+            <wp:extent cx="1080000" cy="1751351"/>
             <wp:docPr id="22" name="Silverthorn" descr="Silverthorn"/>
             <wp:cNvGraphicFramePr>
               <a:graphicFrameLocks noChangeAspect="1"/>
@@ -2617,11 +2617,11 @@
               <a:graphicData uri="http://schemas.openxmlformats.org/drawingml/2006/picture">
                 <pic:pic>
                   <pic:nvPicPr>
-                    <pic:cNvPr id="0" name="image.png"/>
+                    <pic:cNvPr id="0" name="arma_Silverthorn.png"/>
                     <pic:cNvPicPr/>
                   </pic:nvPicPr>
                   <pic:blipFill>
-                    <a:blip r:embed="rId28"/>
+                    <a:blip r:embed="rId31"/>
                     <a:stretch>
                       <a:fillRect/>
                     </a:stretch>
@@ -2629,7 +2629,7 @@
                   <pic:spPr>
                     <a:xfrm>
                       <a:off x="0" y="0"/>
-                      <a:ext cx="1080000" cy="1080000"/>
+                      <a:ext cx="1080000" cy="1751351"/>
                     </a:xfrm>
                     <a:prstGeom prst="rect"/>
                   </pic:spPr>
@@ -2682,7 +2682,7 @@
       <w:r>
         <w:drawing>
           <wp:inline xmlns:a="http://schemas.openxmlformats.org/drawingml/2006/main" xmlns:pic="http://schemas.openxmlformats.org/drawingml/2006/picture">
-            <wp:extent cx="1080000" cy="1080000"/>
+            <wp:extent cx="1080000" cy="1808372"/>
             <wp:docPr id="23" name="Mac Alister" descr="Mac Alister"/>
             <wp:cNvGraphicFramePr>
               <a:graphicFrameLocks noChangeAspect="1"/>
@@ -2691,11 +2691,11 @@
               <a:graphicData uri="http://schemas.openxmlformats.org/drawingml/2006/picture">
                 <pic:pic>
                   <pic:nvPicPr>
-                    <pic:cNvPr id="0" name="image.png"/>
+                    <pic:cNvPr id="0" name="arma_Mac_Alister.png"/>
                     <pic:cNvPicPr/>
                   </pic:nvPicPr>
                   <pic:blipFill>
-                    <a:blip r:embed="rId29"/>
+                    <a:blip r:embed="rId32"/>
                     <a:stretch>
                       <a:fillRect/>
                     </a:stretch>
@@ -2703,7 +2703,7 @@
                   <pic:spPr>
                     <a:xfrm>
                       <a:off x="0" y="0"/>
-                      <a:ext cx="1080000" cy="1080000"/>
+                      <a:ext cx="1080000" cy="1808372"/>
                     </a:xfrm>
                     <a:prstGeom prst="rect"/>
                   </pic:spPr>
@@ -2756,7 +2756,7 @@
       <w:r>
         <w:drawing>
           <wp:inline xmlns:a="http://schemas.openxmlformats.org/drawingml/2006/main" xmlns:pic="http://schemas.openxmlformats.org/drawingml/2006/picture">
-            <wp:extent cx="1080000" cy="1080000"/>
+            <wp:extent cx="1080000" cy="1586939"/>
             <wp:docPr id="24" name="O’Connor" descr="O’Connor"/>
             <wp:cNvGraphicFramePr>
               <a:graphicFrameLocks noChangeAspect="1"/>
@@ -2765,11 +2765,11 @@
               <a:graphicData uri="http://schemas.openxmlformats.org/drawingml/2006/picture">
                 <pic:pic>
                   <pic:nvPicPr>
-                    <pic:cNvPr id="0" name="image.png"/>
+                    <pic:cNvPr id="0" name="arma_OConnor.png"/>
                     <pic:cNvPicPr/>
                   </pic:nvPicPr>
                   <pic:blipFill>
-                    <a:blip r:embed="rId30"/>
+                    <a:blip r:embed="rId33"/>
                     <a:stretch>
                       <a:fillRect/>
                     </a:stretch>
@@ -2777,7 +2777,7 @@
                   <pic:spPr>
                     <a:xfrm>
                       <a:off x="0" y="0"/>
-                      <a:ext cx="1080000" cy="1080000"/>
+                      <a:ext cx="1080000" cy="1586939"/>
                     </a:xfrm>
                     <a:prstGeom prst="rect"/>
                   </pic:spPr>
@@ -2830,7 +2830,7 @@
       <w:r>
         <w:drawing>
           <wp:inline xmlns:a="http://schemas.openxmlformats.org/drawingml/2006/main" xmlns:pic="http://schemas.openxmlformats.org/drawingml/2006/picture">
-            <wp:extent cx="1080000" cy="1080000"/>
+            <wp:extent cx="1080000" cy="1743498"/>
             <wp:docPr id="25" name="Nightvale" descr="Nightvale"/>
             <wp:cNvGraphicFramePr>
               <a:graphicFrameLocks noChangeAspect="1"/>
@@ -2839,11 +2839,11 @@
               <a:graphicData uri="http://schemas.openxmlformats.org/drawingml/2006/picture">
                 <pic:pic>
                   <pic:nvPicPr>
-                    <pic:cNvPr id="0" name="image.png"/>
+                    <pic:cNvPr id="0" name="arma_Nightvale.png"/>
                     <pic:cNvPicPr/>
                   </pic:nvPicPr>
                   <pic:blipFill>
-                    <a:blip r:embed="rId31"/>
+                    <a:blip r:embed="rId34"/>
                     <a:stretch>
                       <a:fillRect/>
                     </a:stretch>
@@ -2851,7 +2851,7 @@
                   <pic:spPr>
                     <a:xfrm>
                       <a:off x="0" y="0"/>
-                      <a:ext cx="1080000" cy="1080000"/>
+                      <a:ext cx="1080000" cy="1743498"/>
                     </a:xfrm>
                     <a:prstGeom prst="rect"/>
                   </pic:spPr>
@@ -2904,7 +2904,7 @@
       <w:r>
         <w:drawing>
           <wp:inline xmlns:a="http://schemas.openxmlformats.org/drawingml/2006/main" xmlns:pic="http://schemas.openxmlformats.org/drawingml/2006/picture">
-            <wp:extent cx="1080000" cy="1080000"/>
+            <wp:extent cx="1080000" cy="1690435"/>
             <wp:docPr id="26" name="Ashborne" descr="Ashborne"/>
             <wp:cNvGraphicFramePr>
               <a:graphicFrameLocks noChangeAspect="1"/>
@@ -2913,11 +2913,11 @@
               <a:graphicData uri="http://schemas.openxmlformats.org/drawingml/2006/picture">
                 <pic:pic>
                   <pic:nvPicPr>
-                    <pic:cNvPr id="0" name="image.png"/>
+                    <pic:cNvPr id="0" name="arma_Ashborne.png"/>
                     <pic:cNvPicPr/>
                   </pic:nvPicPr>
                   <pic:blipFill>
-                    <a:blip r:embed="rId32"/>
+                    <a:blip r:embed="rId35"/>
                     <a:stretch>
                       <a:fillRect/>
                     </a:stretch>
@@ -2925,7 +2925,7 @@
                   <pic:spPr>
                     <a:xfrm>
                       <a:off x="0" y="0"/>
-                      <a:ext cx="1080000" cy="1080000"/>
+                      <a:ext cx="1080000" cy="1690435"/>
                     </a:xfrm>
                     <a:prstGeom prst="rect"/>
                   </pic:spPr>
@@ -2997,7 +2997,7 @@
       <w:r>
         <w:drawing>
           <wp:inline xmlns:a="http://schemas.openxmlformats.org/drawingml/2006/main" xmlns:pic="http://schemas.openxmlformats.org/drawingml/2006/picture">
-            <wp:extent cx="1080000" cy="1080000"/>
+            <wp:extent cx="1080000" cy="1378723"/>
             <wp:docPr id="27" name="Aquamere" descr="Aquamere"/>
             <wp:cNvGraphicFramePr>
               <a:graphicFrameLocks noChangeAspect="1"/>
@@ -3006,11 +3006,11 @@
               <a:graphicData uri="http://schemas.openxmlformats.org/drawingml/2006/picture">
                 <pic:pic>
                   <pic:nvPicPr>
-                    <pic:cNvPr id="0" name="image.png"/>
+                    <pic:cNvPr id="0" name="arma_Aquamere.png"/>
                     <pic:cNvPicPr/>
                   </pic:nvPicPr>
                   <pic:blipFill>
-                    <a:blip r:embed="rId14"/>
+                    <a:blip r:embed="rId36"/>
                     <a:stretch>
                       <a:fillRect/>
                     </a:stretch>
@@ -3018,7 +3018,7 @@
                   <pic:spPr>
                     <a:xfrm>
                       <a:off x="0" y="0"/>
-                      <a:ext cx="1080000" cy="1080000"/>
+                      <a:ext cx="1080000" cy="1378723"/>
                     </a:xfrm>
                     <a:prstGeom prst="rect"/>
                   </pic:spPr>
@@ -3071,7 +3071,7 @@
       <w:r>
         <w:drawing>
           <wp:inline xmlns:a="http://schemas.openxmlformats.org/drawingml/2006/main" xmlns:pic="http://schemas.openxmlformats.org/drawingml/2006/picture">
-            <wp:extent cx="1080000" cy="1080000"/>
+            <wp:extent cx="1080000" cy="1418978"/>
             <wp:docPr id="28" name="Blackfish" descr="Blackfish"/>
             <wp:cNvGraphicFramePr>
               <a:graphicFrameLocks noChangeAspect="1"/>
@@ -3080,11 +3080,11 @@
               <a:graphicData uri="http://schemas.openxmlformats.org/drawingml/2006/picture">
                 <pic:pic>
                   <pic:nvPicPr>
-                    <pic:cNvPr id="0" name="image5.png"/>
+                    <pic:cNvPr id="0" name="arma_Blackfish.png"/>
                     <pic:cNvPicPr/>
                   </pic:nvPicPr>
                   <pic:blipFill>
-                    <a:blip r:embed="rId33"/>
+                    <a:blip r:embed="rId37"/>
                     <a:stretch>
                       <a:fillRect/>
                     </a:stretch>
@@ -3092,7 +3092,7 @@
                   <pic:spPr>
                     <a:xfrm>
                       <a:off x="0" y="0"/>
-                      <a:ext cx="1080000" cy="1080000"/>
+                      <a:ext cx="1080000" cy="1418978"/>
                     </a:xfrm>
                     <a:prstGeom prst="rect"/>
                   </pic:spPr>
@@ -3145,7 +3145,7 @@
       <w:r>
         <w:drawing>
           <wp:inline xmlns:a="http://schemas.openxmlformats.org/drawingml/2006/main" xmlns:pic="http://schemas.openxmlformats.org/drawingml/2006/picture">
-            <wp:extent cx="1080000" cy="1080000"/>
+            <wp:extent cx="1080000" cy="1354704"/>
             <wp:docPr id="29" name="Harborly" descr="Harborly"/>
             <wp:cNvGraphicFramePr>
               <a:graphicFrameLocks noChangeAspect="1"/>
@@ -3154,11 +3154,11 @@
               <a:graphicData uri="http://schemas.openxmlformats.org/drawingml/2006/picture">
                 <pic:pic>
                   <pic:nvPicPr>
-                    <pic:cNvPr id="0" name="image11.png"/>
+                    <pic:cNvPr id="0" name="arma_Harborly.png"/>
                     <pic:cNvPicPr/>
                   </pic:nvPicPr>
                   <pic:blipFill>
-                    <a:blip r:embed="rId34"/>
+                    <a:blip r:embed="rId38"/>
                     <a:stretch>
                       <a:fillRect/>
                     </a:stretch>
@@ -3166,7 +3166,7 @@
                   <pic:spPr>
                     <a:xfrm>
                       <a:off x="0" y="0"/>
-                      <a:ext cx="1080000" cy="1080000"/>
+                      <a:ext cx="1080000" cy="1354704"/>
                     </a:xfrm>
                     <a:prstGeom prst="rect"/>
                   </pic:spPr>
@@ -3219,7 +3219,7 @@
       <w:r>
         <w:drawing>
           <wp:inline xmlns:a="http://schemas.openxmlformats.org/drawingml/2006/main" xmlns:pic="http://schemas.openxmlformats.org/drawingml/2006/picture">
-            <wp:extent cx="1080000" cy="1080000"/>
+            <wp:extent cx="1080000" cy="1456180"/>
             <wp:docPr id="30" name="Dos Valen" descr="Dos Valen"/>
             <wp:cNvGraphicFramePr>
               <a:graphicFrameLocks noChangeAspect="1"/>
@@ -3228,11 +3228,11 @@
               <a:graphicData uri="http://schemas.openxmlformats.org/drawingml/2006/picture">
                 <pic:pic>
                   <pic:nvPicPr>
-                    <pic:cNvPr id="0" name="image25.png"/>
+                    <pic:cNvPr id="0" name="arma_Dos_Valen.png"/>
                     <pic:cNvPicPr/>
                   </pic:nvPicPr>
                   <pic:blipFill>
-                    <a:blip r:embed="rId35"/>
+                    <a:blip r:embed="rId39"/>
                     <a:stretch>
                       <a:fillRect/>
                     </a:stretch>
@@ -3240,7 +3240,7 @@
                   <pic:spPr>
                     <a:xfrm>
                       <a:off x="0" y="0"/>
-                      <a:ext cx="1080000" cy="1080000"/>
+                      <a:ext cx="1080000" cy="1456180"/>
                     </a:xfrm>
                     <a:prstGeom prst="rect"/>
                   </pic:spPr>
@@ -3293,7 +3293,7 @@
       <w:r>
         <w:drawing>
           <wp:inline xmlns:a="http://schemas.openxmlformats.org/drawingml/2006/main" xmlns:pic="http://schemas.openxmlformats.org/drawingml/2006/picture">
-            <wp:extent cx="1080000" cy="1080000"/>
+            <wp:extent cx="1080000" cy="1309091"/>
             <wp:docPr id="31" name="Del Valle" descr="Del Valle"/>
             <wp:cNvGraphicFramePr>
               <a:graphicFrameLocks noChangeAspect="1"/>
@@ -3302,11 +3302,11 @@
               <a:graphicData uri="http://schemas.openxmlformats.org/drawingml/2006/picture">
                 <pic:pic>
                   <pic:nvPicPr>
-                    <pic:cNvPr id="0" name="image31.png"/>
+                    <pic:cNvPr id="0" name="arma_Del_Valle.png"/>
                     <pic:cNvPicPr/>
                   </pic:nvPicPr>
                   <pic:blipFill>
-                    <a:blip r:embed="rId36"/>
+                    <a:blip r:embed="rId40"/>
                     <a:stretch>
                       <a:fillRect/>
                     </a:stretch>
@@ -3314,7 +3314,7 @@
                   <pic:spPr>
                     <a:xfrm>
                       <a:off x="0" y="0"/>
-                      <a:ext cx="1080000" cy="1080000"/>
+                      <a:ext cx="1080000" cy="1309091"/>
                     </a:xfrm>
                     <a:prstGeom prst="rect"/>
                   </pic:spPr>
@@ -3386,7 +3386,7 @@
       <w:r>
         <w:drawing>
           <wp:inline xmlns:a="http://schemas.openxmlformats.org/drawingml/2006/main" xmlns:pic="http://schemas.openxmlformats.org/drawingml/2006/picture">
-            <wp:extent cx="1080000" cy="1080000"/>
+            <wp:extent cx="1080000" cy="1808372"/>
             <wp:docPr id="32" name="Archantus" descr="Archantus"/>
             <wp:cNvGraphicFramePr>
               <a:graphicFrameLocks noChangeAspect="1"/>
@@ -3395,11 +3395,11 @@
               <a:graphicData uri="http://schemas.openxmlformats.org/drawingml/2006/picture">
                 <pic:pic>
                   <pic:nvPicPr>
-                    <pic:cNvPr id="0" name="image.png"/>
+                    <pic:cNvPr id="0" name="arma_Archantus.png"/>
                     <pic:cNvPicPr/>
                   </pic:nvPicPr>
                   <pic:blipFill>
-                    <a:blip r:embed="rId13"/>
+                    <a:blip r:embed="rId41"/>
                     <a:stretch>
                       <a:fillRect/>
                     </a:stretch>
@@ -3407,7 +3407,7 @@
                   <pic:spPr>
                     <a:xfrm>
                       <a:off x="0" y="0"/>
-                      <a:ext cx="1080000" cy="1080000"/>
+                      <a:ext cx="1080000" cy="1808372"/>
                     </a:xfrm>
                     <a:prstGeom prst="rect"/>
                   </pic:spPr>
@@ -3460,7 +3460,7 @@
       <w:r>
         <w:drawing>
           <wp:inline xmlns:a="http://schemas.openxmlformats.org/drawingml/2006/main" xmlns:pic="http://schemas.openxmlformats.org/drawingml/2006/picture">
-            <wp:extent cx="1080000" cy="1080000"/>
+            <wp:extent cx="1080000" cy="1783486"/>
             <wp:docPr id="33" name="Mystra" descr="Mystra"/>
             <wp:cNvGraphicFramePr>
               <a:graphicFrameLocks noChangeAspect="1"/>
@@ -3469,11 +3469,11 @@
               <a:graphicData uri="http://schemas.openxmlformats.org/drawingml/2006/picture">
                 <pic:pic>
                   <pic:nvPicPr>
-                    <pic:cNvPr id="0" name="image3.png"/>
+                    <pic:cNvPr id="0" name="arma_Mystra.png"/>
                     <pic:cNvPicPr/>
                   </pic:nvPicPr>
                   <pic:blipFill>
-                    <a:blip r:embed="rId37"/>
+                    <a:blip r:embed="rId42"/>
                     <a:stretch>
                       <a:fillRect/>
                     </a:stretch>
@@ -3481,7 +3481,7 @@
                   <pic:spPr>
                     <a:xfrm>
                       <a:off x="0" y="0"/>
-                      <a:ext cx="1080000" cy="1080000"/>
+                      <a:ext cx="1080000" cy="1783486"/>
                     </a:xfrm>
                     <a:prstGeom prst="rect"/>
                   </pic:spPr>
@@ -3534,7 +3534,7 @@
       <w:r>
         <w:drawing>
           <wp:inline xmlns:a="http://schemas.openxmlformats.org/drawingml/2006/main" xmlns:pic="http://schemas.openxmlformats.org/drawingml/2006/picture">
-            <wp:extent cx="1080000" cy="1080000"/>
+            <wp:extent cx="1080000" cy="1896585"/>
             <wp:docPr id="34" name="Lombliver" descr="Lombliver"/>
             <wp:cNvGraphicFramePr>
               <a:graphicFrameLocks noChangeAspect="1"/>
@@ -3543,11 +3543,11 @@
               <a:graphicData uri="http://schemas.openxmlformats.org/drawingml/2006/picture">
                 <pic:pic>
                   <pic:nvPicPr>
-                    <pic:cNvPr id="0" name="image2.png"/>
+                    <pic:cNvPr id="0" name="arma_Lombliver.png"/>
                     <pic:cNvPicPr/>
                   </pic:nvPicPr>
                   <pic:blipFill>
-                    <a:blip r:embed="rId38"/>
+                    <a:blip r:embed="rId43"/>
                     <a:stretch>
                       <a:fillRect/>
                     </a:stretch>
@@ -3555,7 +3555,7 @@
                   <pic:spPr>
                     <a:xfrm>
                       <a:off x="0" y="0"/>
-                      <a:ext cx="1080000" cy="1080000"/>
+                      <a:ext cx="1080000" cy="1896585"/>
                     </a:xfrm>
                     <a:prstGeom prst="rect"/>
                   </pic:spPr>
@@ -3608,7 +3608,7 @@
       <w:r>
         <w:drawing>
           <wp:inline xmlns:a="http://schemas.openxmlformats.org/drawingml/2006/main" xmlns:pic="http://schemas.openxmlformats.org/drawingml/2006/picture">
-            <wp:extent cx="1080000" cy="1080000"/>
+            <wp:extent cx="1080000" cy="1728000"/>
             <wp:docPr id="35" name="Annexila" descr="Annexila"/>
             <wp:cNvGraphicFramePr>
               <a:graphicFrameLocks noChangeAspect="1"/>
@@ -3617,11 +3617,11 @@
               <a:graphicData uri="http://schemas.openxmlformats.org/drawingml/2006/picture">
                 <pic:pic>
                   <pic:nvPicPr>
-                    <pic:cNvPr id="0" name="image1.png"/>
+                    <pic:cNvPr id="0" name="arma_Annexila.png"/>
                     <pic:cNvPicPr/>
                   </pic:nvPicPr>
                   <pic:blipFill>
-                    <a:blip r:embed="rId39"/>
+                    <a:blip r:embed="rId44"/>
                     <a:stretch>
                       <a:fillRect/>
                     </a:stretch>
@@ -3629,7 +3629,7 @@
                   <pic:spPr>
                     <a:xfrm>
                       <a:off x="0" y="0"/>
-                      <a:ext cx="1080000" cy="1080000"/>
+                      <a:ext cx="1080000" cy="1728000"/>
                     </a:xfrm>
                     <a:prstGeom prst="rect"/>
                   </pic:spPr>
@@ -3682,7 +3682,7 @@
       <w:r>
         <w:drawing>
           <wp:inline xmlns:a="http://schemas.openxmlformats.org/drawingml/2006/main" xmlns:pic="http://schemas.openxmlformats.org/drawingml/2006/picture">
-            <wp:extent cx="1080000" cy="1080000"/>
+            <wp:extent cx="1080000" cy="1833962"/>
             <wp:docPr id="36" name="Von Draken" descr="Von Draken"/>
             <wp:cNvGraphicFramePr>
               <a:graphicFrameLocks noChangeAspect="1"/>
@@ -3691,11 +3691,11 @@
               <a:graphicData uri="http://schemas.openxmlformats.org/drawingml/2006/picture">
                 <pic:pic>
                   <pic:nvPicPr>
-                    <pic:cNvPr id="0" name="image19.png"/>
+                    <pic:cNvPr id="0" name="arma_Von_Draken.png"/>
                     <pic:cNvPicPr/>
                   </pic:nvPicPr>
                   <pic:blipFill>
-                    <a:blip r:embed="rId40"/>
+                    <a:blip r:embed="rId45"/>
                     <a:stretch>
                       <a:fillRect/>
                     </a:stretch>
@@ -3703,7 +3703,7 @@
                   <pic:spPr>
                     <a:xfrm>
                       <a:off x="0" y="0"/>
-                      <a:ext cx="1080000" cy="1080000"/>
+                      <a:ext cx="1080000" cy="1833962"/>
                     </a:xfrm>
                     <a:prstGeom prst="rect"/>
                   </pic:spPr>
@@ -3756,7 +3756,7 @@
       <w:r>
         <w:drawing>
           <wp:inline xmlns:a="http://schemas.openxmlformats.org/drawingml/2006/main" xmlns:pic="http://schemas.openxmlformats.org/drawingml/2006/picture">
-            <wp:extent cx="1080000" cy="1080000"/>
+            <wp:extent cx="1080000" cy="2046316"/>
             <wp:docPr id="37" name="La Seraphine" descr="La Seraphine"/>
             <wp:cNvGraphicFramePr>
               <a:graphicFrameLocks noChangeAspect="1"/>
@@ -3765,11 +3765,11 @@
               <a:graphicData uri="http://schemas.openxmlformats.org/drawingml/2006/picture">
                 <pic:pic>
                   <pic:nvPicPr>
-                    <pic:cNvPr id="0" name="image18.png"/>
+                    <pic:cNvPr id="0" name="arma_La_Seraphine.png"/>
                     <pic:cNvPicPr/>
                   </pic:nvPicPr>
                   <pic:blipFill>
-                    <a:blip r:embed="rId41"/>
+                    <a:blip r:embed="rId46"/>
                     <a:stretch>
                       <a:fillRect/>
                     </a:stretch>
@@ -3777,7 +3777,7 @@
                   <pic:spPr>
                     <a:xfrm>
                       <a:off x="0" y="0"/>
-                      <a:ext cx="1080000" cy="1080000"/>
+                      <a:ext cx="1080000" cy="2046316"/>
                     </a:xfrm>
                     <a:prstGeom prst="rect"/>
                   </pic:spPr>
@@ -3849,7 +3849,7 @@
       <w:r>
         <w:drawing>
           <wp:inline xmlns:a="http://schemas.openxmlformats.org/drawingml/2006/main" xmlns:pic="http://schemas.openxmlformats.org/drawingml/2006/picture">
-            <wp:extent cx="1080000" cy="1080000"/>
+            <wp:extent cx="1080000" cy="1291694"/>
             <wp:docPr id="38" name="Greenhall" descr="Greenhall"/>
             <wp:cNvGraphicFramePr>
               <a:graphicFrameLocks noChangeAspect="1"/>
@@ -3858,11 +3858,11 @@
               <a:graphicData uri="http://schemas.openxmlformats.org/drawingml/2006/picture">
                 <pic:pic>
                   <pic:nvPicPr>
-                    <pic:cNvPr id="0" name="image.png"/>
+                    <pic:cNvPr id="0" name="arma_Greenhall.png"/>
                     <pic:cNvPicPr/>
                   </pic:nvPicPr>
                   <pic:blipFill>
-                    <a:blip r:embed="rId15"/>
+                    <a:blip r:embed="rId47"/>
                     <a:stretch>
                       <a:fillRect/>
                     </a:stretch>
@@ -3870,7 +3870,7 @@
                   <pic:spPr>
                     <a:xfrm>
                       <a:off x="0" y="0"/>
-                      <a:ext cx="1080000" cy="1080000"/>
+                      <a:ext cx="1080000" cy="1291694"/>
                     </a:xfrm>
                     <a:prstGeom prst="rect"/>
                   </pic:spPr>
@@ -3923,7 +3923,7 @@
       <w:r>
         <w:drawing>
           <wp:inline xmlns:a="http://schemas.openxmlformats.org/drawingml/2006/main" xmlns:pic="http://schemas.openxmlformats.org/drawingml/2006/picture">
-            <wp:extent cx="1080000" cy="1080000"/>
+            <wp:extent cx="1080000" cy="1359441"/>
             <wp:docPr id="39" name="Frontier" descr="Frontier"/>
             <wp:cNvGraphicFramePr>
               <a:graphicFrameLocks noChangeAspect="1"/>
@@ -3932,11 +3932,11 @@
               <a:graphicData uri="http://schemas.openxmlformats.org/drawingml/2006/picture">
                 <pic:pic>
                   <pic:nvPicPr>
-                    <pic:cNvPr id="0" name="image15.png"/>
+                    <pic:cNvPr id="0" name="arma_Frontier.png"/>
                     <pic:cNvPicPr/>
                   </pic:nvPicPr>
                   <pic:blipFill>
-                    <a:blip r:embed="rId42"/>
+                    <a:blip r:embed="rId48"/>
                     <a:stretch>
                       <a:fillRect/>
                     </a:stretch>
@@ -3944,7 +3944,7 @@
                   <pic:spPr>
                     <a:xfrm>
                       <a:off x="0" y="0"/>
-                      <a:ext cx="1080000" cy="1080000"/>
+                      <a:ext cx="1080000" cy="1359441"/>
                     </a:xfrm>
                     <a:prstGeom prst="rect"/>
                   </pic:spPr>
@@ -3997,7 +3997,7 @@
       <w:r>
         <w:drawing>
           <wp:inline xmlns:a="http://schemas.openxmlformats.org/drawingml/2006/main" xmlns:pic="http://schemas.openxmlformats.org/drawingml/2006/picture">
-            <wp:extent cx="1080000" cy="1080000"/>
+            <wp:extent cx="1080000" cy="1398561"/>
             <wp:docPr id="40" name="Slezk" descr="Slezk"/>
             <wp:cNvGraphicFramePr>
               <a:graphicFrameLocks noChangeAspect="1"/>
@@ -4006,11 +4006,11 @@
               <a:graphicData uri="http://schemas.openxmlformats.org/drawingml/2006/picture">
                 <pic:pic>
                   <pic:nvPicPr>
-                    <pic:cNvPr id="0" name="image26.png"/>
+                    <pic:cNvPr id="0" name="arma_Slezk.png"/>
                     <pic:cNvPicPr/>
                   </pic:nvPicPr>
                   <pic:blipFill>
-                    <a:blip r:embed="rId43"/>
+                    <a:blip r:embed="rId49"/>
                     <a:stretch>
                       <a:fillRect/>
                     </a:stretch>
@@ -4018,7 +4018,7 @@
                   <pic:spPr>
                     <a:xfrm>
                       <a:off x="0" y="0"/>
-                      <a:ext cx="1080000" cy="1080000"/>
+                      <a:ext cx="1080000" cy="1398561"/>
                     </a:xfrm>
                     <a:prstGeom prst="rect"/>
                   </pic:spPr>

</xml_diff>

<commit_message>
Add new civic seals for the six great cities
New round seals keep each city's old symbol (flower, dove, rose, six stars,
compass rose, oak) and add details from the city texts. Prompts are recorded
in Arma_Promptlari.md and Carya_Imparatorluk.docx is rebuilt.

Co-Authored-By: Claude Opus 5.5 <noreply@anthropic.com>
Claude-Session: https://claude.ai/code/session_01Mfzr2E3Ey9o3G5KUSC6GaD
</commit_message>
<xml_diff>
--- a/docx/Carya_Imparatorluk.docx
+++ b/docx/Carya_Imparatorluk.docx
@@ -112,7 +112,7 @@
       <w:r>
         <w:drawing>
           <wp:inline xmlns:a="http://schemas.openxmlformats.org/drawingml/2006/main" xmlns:pic="http://schemas.openxmlformats.org/drawingml/2006/picture">
-            <wp:extent cx="1080000" cy="1080000"/>
+            <wp:extent cx="1080000" cy="1098305"/>
             <wp:docPr id="1" name="Florentina" descr="Florentina"/>
             <wp:cNvGraphicFramePr>
               <a:graphicFrameLocks noChangeAspect="1"/>
@@ -121,7 +121,7 @@
               <a:graphicData uri="http://schemas.openxmlformats.org/drawingml/2006/picture">
                 <pic:pic>
                   <pic:nvPicPr>
-                    <pic:cNvPr id="0" name="image.png"/>
+                    <pic:cNvPr id="0" name="amblem_Florentina.png"/>
                     <pic:cNvPicPr/>
                   </pic:nvPicPr>
                   <pic:blipFill>
@@ -133,7 +133,7 @@
                   <pic:spPr>
                     <a:xfrm>
                       <a:off x="0" y="0"/>
-                      <a:ext cx="1080000" cy="1080000"/>
+                      <a:ext cx="1080000" cy="1098305"/>
                     </a:xfrm>
                     <a:prstGeom prst="rect"/>
                   </pic:spPr>
@@ -244,7 +244,7 @@
       <w:r>
         <w:drawing>
           <wp:inline xmlns:a="http://schemas.openxmlformats.org/drawingml/2006/main" xmlns:pic="http://schemas.openxmlformats.org/drawingml/2006/picture">
-            <wp:extent cx="1080000" cy="1080000"/>
+            <wp:extent cx="1080000" cy="1095211"/>
             <wp:docPr id="2" name="Serenquill" descr="Serenquill"/>
             <wp:cNvGraphicFramePr>
               <a:graphicFrameLocks noChangeAspect="1"/>
@@ -253,7 +253,7 @@
               <a:graphicData uri="http://schemas.openxmlformats.org/drawingml/2006/picture">
                 <pic:pic>
                   <pic:nvPicPr>
-                    <pic:cNvPr id="0" name="image.png"/>
+                    <pic:cNvPr id="0" name="amblem_Serenquill.png"/>
                     <pic:cNvPicPr/>
                   </pic:nvPicPr>
                   <pic:blipFill>
@@ -265,7 +265,7 @@
                   <pic:spPr>
                     <a:xfrm>
                       <a:off x="0" y="0"/>
-                      <a:ext cx="1080000" cy="1080000"/>
+                      <a:ext cx="1080000" cy="1095211"/>
                     </a:xfrm>
                     <a:prstGeom prst="rect"/>
                   </pic:spPr>
@@ -364,7 +364,7 @@
       <w:r>
         <w:drawing>
           <wp:inline xmlns:a="http://schemas.openxmlformats.org/drawingml/2006/main" xmlns:pic="http://schemas.openxmlformats.org/drawingml/2006/picture">
-            <wp:extent cx="1080000" cy="1080000"/>
+            <wp:extent cx="1080000" cy="1098305"/>
             <wp:docPr id="3" name="Venture" descr="Venture"/>
             <wp:cNvGraphicFramePr>
               <a:graphicFrameLocks noChangeAspect="1"/>
@@ -373,7 +373,7 @@
               <a:graphicData uri="http://schemas.openxmlformats.org/drawingml/2006/picture">
                 <pic:pic>
                   <pic:nvPicPr>
-                    <pic:cNvPr id="0" name="image.png"/>
+                    <pic:cNvPr id="0" name="amblem_Venture.png"/>
                     <pic:cNvPicPr/>
                   </pic:nvPicPr>
                   <pic:blipFill>
@@ -385,7 +385,7 @@
                   <pic:spPr>
                     <a:xfrm>
                       <a:off x="0" y="0"/>
-                      <a:ext cx="1080000" cy="1080000"/>
+                      <a:ext cx="1080000" cy="1098305"/>
                     </a:xfrm>
                     <a:prstGeom prst="rect"/>
                   </pic:spPr>
@@ -484,7 +484,7 @@
       <w:r>
         <w:drawing>
           <wp:inline xmlns:a="http://schemas.openxmlformats.org/drawingml/2006/main" xmlns:pic="http://schemas.openxmlformats.org/drawingml/2006/picture">
-            <wp:extent cx="1080000" cy="1080000"/>
+            <wp:extent cx="1080000" cy="1095211"/>
             <wp:docPr id="4" name="Arcan’s Gate" descr="Arcan’s Gate"/>
             <wp:cNvGraphicFramePr>
               <a:graphicFrameLocks noChangeAspect="1"/>
@@ -493,7 +493,7 @@
               <a:graphicData uri="http://schemas.openxmlformats.org/drawingml/2006/picture">
                 <pic:pic>
                   <pic:nvPicPr>
-                    <pic:cNvPr id="0" name="image.png"/>
+                    <pic:cNvPr id="0" name="amblem_Arcans_Gate.png"/>
                     <pic:cNvPicPr/>
                   </pic:nvPicPr>
                   <pic:blipFill>
@@ -505,7 +505,7 @@
                   <pic:spPr>
                     <a:xfrm>
                       <a:off x="0" y="0"/>
-                      <a:ext cx="1080000" cy="1080000"/>
+                      <a:ext cx="1080000" cy="1095211"/>
                     </a:xfrm>
                     <a:prstGeom prst="rect"/>
                   </pic:spPr>
@@ -592,7 +592,7 @@
       <w:r>
         <w:drawing>
           <wp:inline xmlns:a="http://schemas.openxmlformats.org/drawingml/2006/main" xmlns:pic="http://schemas.openxmlformats.org/drawingml/2006/picture">
-            <wp:extent cx="1080000" cy="1080000"/>
+            <wp:extent cx="1080000" cy="1095211"/>
             <wp:docPr id="5" name="Aquamere" descr="Aquamere"/>
             <wp:cNvGraphicFramePr>
               <a:graphicFrameLocks noChangeAspect="1"/>
@@ -601,7 +601,7 @@
               <a:graphicData uri="http://schemas.openxmlformats.org/drawingml/2006/picture">
                 <pic:pic>
                   <pic:nvPicPr>
-                    <pic:cNvPr id="0" name="image.png"/>
+                    <pic:cNvPr id="0" name="amblem_Aquamere.png"/>
                     <pic:cNvPicPr/>
                   </pic:nvPicPr>
                   <pic:blipFill>
@@ -613,7 +613,7 @@
                   <pic:spPr>
                     <a:xfrm>
                       <a:off x="0" y="0"/>
-                      <a:ext cx="1080000" cy="1080000"/>
+                      <a:ext cx="1080000" cy="1095211"/>
                     </a:xfrm>
                     <a:prstGeom prst="rect"/>
                   </pic:spPr>
@@ -700,7 +700,7 @@
       <w:r>
         <w:drawing>
           <wp:inline xmlns:a="http://schemas.openxmlformats.org/drawingml/2006/main" xmlns:pic="http://schemas.openxmlformats.org/drawingml/2006/picture">
-            <wp:extent cx="1080000" cy="1080000"/>
+            <wp:extent cx="1080000" cy="1101416"/>
             <wp:docPr id="6" name="Greenhall" descr="Greenhall"/>
             <wp:cNvGraphicFramePr>
               <a:graphicFrameLocks noChangeAspect="1"/>
@@ -709,7 +709,7 @@
               <a:graphicData uri="http://schemas.openxmlformats.org/drawingml/2006/picture">
                 <pic:pic>
                   <pic:nvPicPr>
-                    <pic:cNvPr id="0" name="image.png"/>
+                    <pic:cNvPr id="0" name="amblem_Greenhall.png"/>
                     <pic:cNvPicPr/>
                   </pic:nvPicPr>
                   <pic:blipFill>
@@ -721,7 +721,7 @@
                   <pic:spPr>
                     <a:xfrm>
                       <a:off x="0" y="0"/>
-                      <a:ext cx="1080000" cy="1080000"/>
+                      <a:ext cx="1080000" cy="1101416"/>
                     </a:xfrm>
                     <a:prstGeom prst="rect"/>
                   </pic:spPr>

</xml_diff>